<commit_message>
docs: regenerate v1.1 Word deliverables
Regenerate the DOCX deliverables from the canonical Markdown so the Word
versions match the current specs (SRS & SDD at v1.1; SPMP at v1.0). Rebuilt via
pandoc (auto TOC field) + python-docx post-processing: title page, header/footer
with PAGE/NUMPAGES, core metadata, and updateFields so Word refreshes the TOC on
open. No Markdown or application code changed.

Co-Authored-By: Claude Opus 4.8 <noreply@anthropic.com>
</commit_message>
<xml_diff>
--- a/deliverables/word/Software Project Management Plan.docx
+++ b/deliverables/word/Software Project Management Plan.docx
@@ -4,21 +4,16 @@
   <w:body>
     <w:p>
       <w:pPr>
-        <w:spacing w:before="0" w:after="0"/>
+        <w:spacing w:before="1920" w:after="400"/>
         <w:jc w:val="center"/>
       </w:pPr>
-    </w:p>
-    <w:p>
-      <w:pPr>
-        <w:spacing w:before="0" w:after="0"/>
-        <w:jc w:val="center"/>
-      </w:pPr>
-    </w:p>
-    <w:p>
-      <w:pPr>
-        <w:spacing w:before="0" w:after="0"/>
-        <w:jc w:val="center"/>
-      </w:pPr>
+      <w:r>
+        <w:rPr>
+          <w:b w:val="0"/>
+          <w:sz w:val="24"/>
+        </w:rPr>
+        <w:t>AI-Powered IT Asset &amp; Service Management System (SccIT)</w:t>
+      </w:r>
     </w:p>
     <w:p>
       <w:pPr>
@@ -27,43 +22,28 @@
       </w:pPr>
       <w:r>
         <w:rPr>
+          <w:b/>
+          <w:sz w:val="52"/>
+        </w:rPr>
+        <w:t>Software Project Management Plan (SPMP)</w:t>
+      </w:r>
+    </w:p>
+    <w:p>
+      <w:pPr>
+        <w:spacing w:before="0" w:after="600"/>
+        <w:jc w:val="center"/>
+      </w:pPr>
+      <w:r>
+        <w:rPr>
           <w:b w:val="0"/>
-          <w:color w:val="555555"/>
           <w:sz w:val="24"/>
         </w:rPr>
-        <w:t>AI-Powered IT Asset &amp; Service Management System (SccIT)</w:t>
-      </w:r>
-    </w:p>
-    <w:p>
-      <w:pPr>
-        <w:spacing w:before="0" w:after="40"/>
-        <w:jc w:val="center"/>
-      </w:pPr>
-      <w:r>
-        <w:rPr>
-          <w:b/>
-          <w:sz w:val="52"/>
-        </w:rPr>
-        <w:t>Software Project Management Plan (SPMP)</w:t>
-      </w:r>
-    </w:p>
-    <w:p>
-      <w:pPr>
-        <w:spacing w:before="0" w:after="360"/>
-        <w:jc w:val="center"/>
-      </w:pPr>
-      <w:r>
-        <w:rPr>
-          <w:b w:val="0"/>
-          <w:color w:val="555555"/>
-          <w:sz w:val="26"/>
-        </w:rPr>
         <w:t>Codename “SccIT”</w:t>
       </w:r>
     </w:p>
     <w:p>
       <w:pPr>
-        <w:spacing w:before="0" w:after="120"/>
+        <w:spacing w:before="0" w:after="80"/>
         <w:jc w:val="center"/>
       </w:pPr>
       <w:r>
@@ -76,20 +56,7 @@
     </w:p>
     <w:p>
       <w:pPr>
-        <w:spacing w:before="0" w:after="120"/>
-        <w:jc w:val="center"/>
-      </w:pPr>
-      <w:r>
-        <w:rPr>
-          <w:b/>
-          <w:sz w:val="22"/>
-        </w:rPr>
-        <w:t>Version 1.0  ·  Approved — v1.0 Baseline (2026-07-03)</w:t>
-      </w:r>
-    </w:p>
-    <w:p>
-      <w:pPr>
-        <w:spacing w:before="0" w:after="120"/>
+        <w:spacing w:before="0" w:after="80"/>
         <w:jc w:val="center"/>
       </w:pPr>
       <w:r>
@@ -97,12 +64,12 @@
           <w:b w:val="0"/>
           <w:sz w:val="22"/>
         </w:rPr>
-        <w:t>Date:  2026-07-03</w:t>
-      </w:r>
-    </w:p>
-    <w:p>
-      <w:pPr>
-        <w:spacing w:before="0" w:after="120"/>
+        <w:t>Version 1.0  •  Approved — v1.0 Baseline (2026-07-03)</w:t>
+      </w:r>
+    </w:p>
+    <w:p>
+      <w:pPr>
+        <w:spacing w:before="0" w:after="80"/>
         <w:jc w:val="center"/>
       </w:pPr>
       <w:r>
@@ -110,12 +77,12 @@
           <w:b w:val="0"/>
           <w:sz w:val="22"/>
         </w:rPr>
-        <w:t>Prepared by:  Engineering (Beemo)</w:t>
-      </w:r>
-    </w:p>
-    <w:p>
-      <w:pPr>
-        <w:spacing w:before="0" w:after="120"/>
+        <w:t>Date:  2026-07-03</w:t>
+      </w:r>
+    </w:p>
+    <w:p>
+      <w:pPr>
+        <w:spacing w:before="0" w:after="80"/>
         <w:jc w:val="center"/>
       </w:pPr>
       <w:r>
@@ -123,35 +90,33 @@
           <w:b w:val="0"/>
           <w:sz w:val="22"/>
         </w:rPr>
+        <w:t>Prepared by:  Engineering (Beemo)</w:t>
+      </w:r>
+    </w:p>
+    <w:p>
+      <w:pPr>
+        <w:spacing w:before="0" w:after="80"/>
+        <w:jc w:val="center"/>
+      </w:pPr>
+      <w:r>
+        <w:rPr>
+          <w:b w:val="0"/>
+          <w:sz w:val="22"/>
+        </w:rPr>
         <w:t>Classification:  Internal — Confidential</w:t>
       </w:r>
     </w:p>
     <w:p>
       <w:pPr>
-        <w:spacing w:before="0" w:after="360"/>
+        <w:spacing w:before="0" w:after="80"/>
         <w:jc w:val="center"/>
       </w:pPr>
       <w:r>
         <w:rPr>
           <w:b w:val="0"/>
-          <w:color w:val="555555"/>
-          <w:sz w:val="20"/>
+          <w:sz w:val="22"/>
         </w:rPr>
         <w:t>Conformance:  Aligned with ISO/IEC/IEEE 16326:2019 (Project Management) — successor to IEEE Std 1058</w:t>
-      </w:r>
-    </w:p>
-    <w:p>
-      <w:pPr>
-        <w:spacing w:before="0" w:after="120"/>
-        <w:jc w:val="center"/>
-      </w:pPr>
-      <w:r>
-        <w:rPr>
-          <w:b w:val="0"/>
-          <w:color w:val="555555"/>
-          <w:sz w:val="20"/>
-        </w:rPr>
-        <w:t>Approved architectural &amp; documentation baseline — Version 1.0 Project Specification</w:t>
       </w:r>
     </w:p>
     <w:p>
@@ -185,7 +150,7 @@
         </w:p>
       </w:sdtContent>
     </w:sdt>
-    <w:bookmarkStart w:id="63" w:name="software-project-management-plan"/>
+    <w:bookmarkStart w:id="64" w:name="software-project-management-plan"/>
     <w:p>
       <w:pPr>
         <w:pStyle w:val="Heading1"/>
@@ -1219,173 +1184,609 @@
     </w:p>
     <w:bookmarkEnd w:id="10"/>
     <w:bookmarkEnd w:id="11"/>
-    <w:bookmarkStart w:id="12" w:name="X102b2e9de4183984340b81b0bb402a984d3925a"/>
+    <w:bookmarkStart w:id="12" w:name="table-of-contents"/>
     <w:p>
       <w:pPr>
         <w:pStyle w:val="Heading2"/>
       </w:pPr>
       <w:r>
-        <w:t xml:space="preserve">1. Executive Summary</w:t>
-      </w:r>
-    </w:p>
-    <w:p>
-      <w:pPr>
-        <w:pStyle w:val="FirstParagraph"/>
-      </w:pPr>
-      <w:r>
-        <w:t xml:space="preserve">SccIT is a production-intended, vertical-agnostic ITSM/ITAM platform. Its</w:t>
-      </w:r>
-      <w:r>
-        <w:t xml:space="preserve"> </w:t>
-      </w:r>
-      <w:r>
-        <w:rPr>
-          <w:b/>
-          <w:bCs/>
-        </w:rPr>
-        <w:t xml:space="preserve">foundation is already built and verified</w:t>
-      </w:r>
-      <w:r>
-        <w:t xml:space="preserve">: a fully Dockerized Laravel 13 + React 19 stack, a production-grade PostgreSQL 17 data layer (66 models, integrity enforced in the database), and a green CI pipeline (phases 0–7). The</w:t>
-      </w:r>
-      <w:r>
-        <w:t xml:space="preserve"> </w:t>
-      </w:r>
-      <w:r>
-        <w:rPr>
-          <w:b/>
-          <w:bCs/>
-        </w:rPr>
-        <w:t xml:space="preserve">requirements (SRS) and design (SDD) are approved.</w:t>
-      </w:r>
-      <w:r>
-        <w:t xml:space="preserve"> </w:t>
-      </w:r>
-      <w:r>
-        <w:t xml:space="preserve">This SPMP governs the remaining lifecycle: building the application layer across three phases —</w:t>
-      </w:r>
-      <w:r>
-        <w:t xml:space="preserve"> </w:t>
-      </w:r>
-      <w:r>
-        <w:rPr>
-          <w:b/>
-          <w:bCs/>
-        </w:rPr>
-        <w:t xml:space="preserve">P2 Core</w:t>
-      </w:r>
-      <w:r>
-        <w:t xml:space="preserve">,</w:t>
-      </w:r>
-      <w:r>
-        <w:t xml:space="preserve"> </w:t>
-      </w:r>
-      <w:r>
-        <w:rPr>
-          <w:b/>
-          <w:bCs/>
-        </w:rPr>
-        <w:t xml:space="preserve">P3 AI &amp; Knowledge Base</w:t>
-      </w:r>
-      <w:r>
-        <w:t xml:space="preserve">,</w:t>
-      </w:r>
-      <w:r>
-        <w:t xml:space="preserve"> </w:t>
-      </w:r>
-      <w:r>
-        <w:rPr>
-          <w:b/>
-          <w:bCs/>
-        </w:rPr>
-        <w:t xml:space="preserve">P4 Interactive Floor Plan &amp; Real-time</w:t>
-      </w:r>
-      <w:r>
-        <w:t xml:space="preserve"> </w:t>
-      </w:r>
-      <w:r>
-        <w:t xml:space="preserve">— followed by steady-state maintenance.</w:t>
-      </w:r>
-    </w:p>
-    <w:p>
-      <w:pPr>
-        <w:pStyle w:val="BodyText"/>
-      </w:pPr>
-      <w:r>
-        <w:t xml:space="preserve">The project runs an</w:t>
-      </w:r>
-      <w:r>
-        <w:t xml:space="preserve"> </w:t>
-      </w:r>
-      <w:r>
-        <w:rPr>
-          <w:b/>
-          <w:bCs/>
-        </w:rPr>
-        <w:t xml:space="preserve">iterative, phase-gated</w:t>
-      </w:r>
-      <w:r>
-        <w:t xml:space="preserve"> </w:t>
-      </w:r>
-      <w:r>
-        <w:t xml:space="preserve">model that matches the established working agreement: work proceeds in short sprints inside each phase, and</w:t>
-      </w:r>
-      <w:r>
-        <w:t xml:space="preserve"> </w:t>
-      </w:r>
-      <w:r>
-        <w:rPr>
-          <w:b/>
-          <w:bCs/>
-        </w:rPr>
-        <w:t xml:space="preserve">each phase ends at a client approval gate</w:t>
-      </w:r>
-      <w:r>
-        <w:t xml:space="preserve"> </w:t>
-      </w:r>
-      <w:r>
-        <w:t xml:space="preserve">before the next begins. Quality is non-negotiable and largely automated — every change passes the same gates CI already enforces (Pint, Larastan level 6, Pest; ESLint, Prettier, TypeScript, Vitest, build) — and correctness is backstopped by database constraints, so the “done” bar is objective and repeatable.</w:t>
-      </w:r>
-    </w:p>
-    <w:p>
-      <w:pPr>
-        <w:pStyle w:val="BodyText"/>
-      </w:pPr>
-      <w:r>
-        <w:t xml:space="preserve">Management is deliberately lightweight but disciplined: trunk-based Git with short-lived reviewed branches, a WBS decomposed by the SDD’s domains, milestones defined by</w:t>
-      </w:r>
-      <w:r>
-        <w:t xml:space="preserve"> </w:t>
-      </w:r>
-      <w:r>
-        <w:rPr>
-          <w:i/>
-          <w:iCs/>
-        </w:rPr>
-        <w:t xml:space="preserve">acceptance</w:t>
-      </w:r>
-      <w:r>
-        <w:t xml:space="preserve"> </w:t>
-      </w:r>
-      <w:r>
-        <w:t xml:space="preserve">rather than dates, and a risk register that inherits the SRS’s technical risks and adds project-level ones (schedule, bus-factor, AI-provider dependency, client-gate availability). Because the team size and cadence are not yet fixed, all calendar figures are presented as clearly-labelled assumptions to be confirmed at approval; the</w:t>
-      </w:r>
-      <w:r>
-        <w:t xml:space="preserve"> </w:t>
-      </w:r>
-      <w:r>
-        <w:rPr>
-          <w:i/>
-          <w:iCs/>
-        </w:rPr>
-        <w:t xml:space="preserve">structure</w:t>
-      </w:r>
-      <w:r>
-        <w:t xml:space="preserve"> </w:t>
-      </w:r>
-      <w:r>
-        <w:t xml:space="preserve">of the plan (sequencing, gates, quality bar, deliverables) is firm.</w:t>
-      </w:r>
+        <w:t xml:space="preserve">Table of Contents</w:t>
+      </w:r>
+    </w:p>
+    <w:p>
+      <w:pPr>
+        <w:pStyle w:val="Compact"/>
+        <w:numPr>
+          <w:ilvl w:val="0"/>
+          <w:numId w:val="1002"/>
+        </w:numPr>
+      </w:pPr>
+      <w:hyperlink w:anchor="X102b2e9de4183984340b81b0bb402a984d3925a">
+        <w:r>
+          <w:rPr>
+            <w:rStyle w:val="Hyperlink"/>
+          </w:rPr>
+          <w:t xml:space="preserve">Executive Summary</w:t>
+        </w:r>
+      </w:hyperlink>
+    </w:p>
+    <w:p>
+      <w:pPr>
+        <w:pStyle w:val="Compact"/>
+        <w:numPr>
+          <w:ilvl w:val="0"/>
+          <w:numId w:val="1002"/>
+        </w:numPr>
+      </w:pPr>
+      <w:hyperlink w:anchor="Xe2821c3670825fa1daa3010381e179ed3462c8d">
+        <w:r>
+          <w:rPr>
+            <w:rStyle w:val="Hyperlink"/>
+          </w:rPr>
+          <w:t xml:space="preserve">Project Overview</w:t>
+        </w:r>
+      </w:hyperlink>
+    </w:p>
+    <w:p>
+      <w:pPr>
+        <w:pStyle w:val="Compact"/>
+        <w:numPr>
+          <w:ilvl w:val="0"/>
+          <w:numId w:val="1002"/>
+        </w:numPr>
+      </w:pPr>
+      <w:hyperlink w:anchor="X75c7fc3ae3409a2dc800748cd65d00ae33b40c8">
+        <w:r>
+          <w:rPr>
+            <w:rStyle w:val="Hyperlink"/>
+          </w:rPr>
+          <w:t xml:space="preserve">Objectives</w:t>
+        </w:r>
+      </w:hyperlink>
+    </w:p>
+    <w:p>
+      <w:pPr>
+        <w:pStyle w:val="Compact"/>
+        <w:numPr>
+          <w:ilvl w:val="0"/>
+          <w:numId w:val="1002"/>
+        </w:numPr>
+      </w:pPr>
+      <w:hyperlink w:anchor="X6613e4245a75e88013480f423ae1cd188d10e18">
+        <w:r>
+          <w:rPr>
+            <w:rStyle w:val="Hyperlink"/>
+          </w:rPr>
+          <w:t xml:space="preserve">Scope</w:t>
+        </w:r>
+      </w:hyperlink>
+    </w:p>
+    <w:p>
+      <w:pPr>
+        <w:pStyle w:val="Compact"/>
+        <w:numPr>
+          <w:ilvl w:val="0"/>
+          <w:numId w:val="1002"/>
+        </w:numPr>
+      </w:pPr>
+      <w:hyperlink w:anchor="Xddc721b7327e6412d03edb41e5e9a078bcd2552">
+        <w:r>
+          <w:rPr>
+            <w:rStyle w:val="Hyperlink"/>
+          </w:rPr>
+          <w:t xml:space="preserve">Deliverables</w:t>
+        </w:r>
+      </w:hyperlink>
+    </w:p>
+    <w:p>
+      <w:pPr>
+        <w:pStyle w:val="Compact"/>
+        <w:numPr>
+          <w:ilvl w:val="0"/>
+          <w:numId w:val="1002"/>
+        </w:numPr>
+      </w:pPr>
+      <w:hyperlink w:anchor="Xa536954d252a5395ba1c91301751b3bc36919b0">
+        <w:r>
+          <w:rPr>
+            <w:rStyle w:val="Hyperlink"/>
+          </w:rPr>
+          <w:t xml:space="preserve">Stakeholders</w:t>
+        </w:r>
+      </w:hyperlink>
+    </w:p>
+    <w:p>
+      <w:pPr>
+        <w:pStyle w:val="Compact"/>
+        <w:numPr>
+          <w:ilvl w:val="0"/>
+          <w:numId w:val="1002"/>
+        </w:numPr>
+      </w:pPr>
+      <w:hyperlink w:anchor="X58f9195d3e82ed0424ae8027163b82dea516217">
+        <w:r>
+          <w:rPr>
+            <w:rStyle w:val="Hyperlink"/>
+          </w:rPr>
+          <w:t xml:space="preserve">Team Roles and Responsibilities</w:t>
+        </w:r>
+      </w:hyperlink>
+    </w:p>
+    <w:p>
+      <w:pPr>
+        <w:pStyle w:val="Compact"/>
+        <w:numPr>
+          <w:ilvl w:val="0"/>
+          <w:numId w:val="1002"/>
+        </w:numPr>
+      </w:pPr>
+      <w:hyperlink w:anchor="Xc1c33d12d83ad80ee746dc7588d82c573556d58">
+        <w:r>
+          <w:rPr>
+            <w:rStyle w:val="Hyperlink"/>
+          </w:rPr>
+          <w:t xml:space="preserve">Development Methodology</w:t>
+        </w:r>
+      </w:hyperlink>
+    </w:p>
+    <w:p>
+      <w:pPr>
+        <w:pStyle w:val="Compact"/>
+        <w:numPr>
+          <w:ilvl w:val="0"/>
+          <w:numId w:val="1002"/>
+        </w:numPr>
+      </w:pPr>
+      <w:hyperlink w:anchor="X8386f55e5b192f354be1fd120ec62ef2ff2359e">
+        <w:r>
+          <w:rPr>
+            <w:rStyle w:val="Hyperlink"/>
+          </w:rPr>
+          <w:t xml:space="preserve">Project Organization</w:t>
+        </w:r>
+      </w:hyperlink>
+    </w:p>
+    <w:p>
+      <w:pPr>
+        <w:pStyle w:val="Compact"/>
+        <w:numPr>
+          <w:ilvl w:val="0"/>
+          <w:numId w:val="1002"/>
+        </w:numPr>
+      </w:pPr>
+      <w:hyperlink w:anchor="X11c27c951ee620c48b2c24bff8bc714594e6fa6">
+        <w:r>
+          <w:rPr>
+            <w:rStyle w:val="Hyperlink"/>
+          </w:rPr>
+          <w:t xml:space="preserve">Work Breakdown Structure</w:t>
+        </w:r>
+      </w:hyperlink>
+    </w:p>
+    <w:p>
+      <w:pPr>
+        <w:pStyle w:val="Compact"/>
+        <w:numPr>
+          <w:ilvl w:val="0"/>
+          <w:numId w:val="1002"/>
+        </w:numPr>
+      </w:pPr>
+      <w:hyperlink w:anchor="X9b77de9594754149cd6e99d9256bc8441b2fc76">
+        <w:r>
+          <w:rPr>
+            <w:rStyle w:val="Hyperlink"/>
+          </w:rPr>
+          <w:t xml:space="preserve">Phase Plan</w:t>
+        </w:r>
+      </w:hyperlink>
+    </w:p>
+    <w:p>
+      <w:pPr>
+        <w:pStyle w:val="Compact"/>
+        <w:numPr>
+          <w:ilvl w:val="0"/>
+          <w:numId w:val="1002"/>
+        </w:numPr>
+      </w:pPr>
+      <w:hyperlink w:anchor="X5cb12fe4ddcbbb458aceeecbc9e3be22fde76b5">
+        <w:r>
+          <w:rPr>
+            <w:rStyle w:val="Hyperlink"/>
+          </w:rPr>
+          <w:t xml:space="preserve">Milestones</w:t>
+        </w:r>
+      </w:hyperlink>
+    </w:p>
+    <w:p>
+      <w:pPr>
+        <w:pStyle w:val="Compact"/>
+        <w:numPr>
+          <w:ilvl w:val="0"/>
+          <w:numId w:val="1002"/>
+        </w:numPr>
+      </w:pPr>
+      <w:hyperlink w:anchor="X8f3e2a7a103d4f20361eebc5a710b5a050dfb71">
+        <w:r>
+          <w:rPr>
+            <w:rStyle w:val="Hyperlink"/>
+          </w:rPr>
+          <w:t xml:space="preserve">Development Workflow</w:t>
+        </w:r>
+      </w:hyperlink>
+    </w:p>
+    <w:p>
+      <w:pPr>
+        <w:pStyle w:val="Compact"/>
+        <w:numPr>
+          <w:ilvl w:val="0"/>
+          <w:numId w:val="1002"/>
+        </w:numPr>
+      </w:pPr>
+      <w:hyperlink w:anchor="Xcbc3b83026a23e6e1c3cb3f87441c14385b9a7b">
+        <w:r>
+          <w:rPr>
+            <w:rStyle w:val="Hyperlink"/>
+          </w:rPr>
+          <w:t xml:space="preserve">Git Workflow</w:t>
+        </w:r>
+      </w:hyperlink>
+    </w:p>
+    <w:p>
+      <w:pPr>
+        <w:pStyle w:val="Compact"/>
+        <w:numPr>
+          <w:ilvl w:val="0"/>
+          <w:numId w:val="1002"/>
+        </w:numPr>
+      </w:pPr>
+      <w:hyperlink w:anchor="X1ea1cd2b8b0feb2821e5b74f2fdb6f6f152a418">
+        <w:r>
+          <w:rPr>
+            <w:rStyle w:val="Hyperlink"/>
+          </w:rPr>
+          <w:t xml:space="preserve">Branching Strategy</w:t>
+        </w:r>
+      </w:hyperlink>
+    </w:p>
+    <w:p>
+      <w:pPr>
+        <w:pStyle w:val="Compact"/>
+        <w:numPr>
+          <w:ilvl w:val="0"/>
+          <w:numId w:val="1002"/>
+        </w:numPr>
+      </w:pPr>
+      <w:hyperlink w:anchor="X9907c49effc2748f3ea89d9d7f9abb59407184a">
+        <w:r>
+          <w:rPr>
+            <w:rStyle w:val="Hyperlink"/>
+          </w:rPr>
+          <w:t xml:space="preserve">Code Review Process</w:t>
+        </w:r>
+      </w:hyperlink>
+    </w:p>
+    <w:p>
+      <w:pPr>
+        <w:pStyle w:val="Compact"/>
+        <w:numPr>
+          <w:ilvl w:val="0"/>
+          <w:numId w:val="1002"/>
+        </w:numPr>
+      </w:pPr>
+      <w:hyperlink w:anchor="X97180518543c19c1ef6861fd219454448064f99">
+        <w:r>
+          <w:rPr>
+            <w:rStyle w:val="Hyperlink"/>
+          </w:rPr>
+          <w:t xml:space="preserve">Documentation Strategy</w:t>
+        </w:r>
+      </w:hyperlink>
+    </w:p>
+    <w:p>
+      <w:pPr>
+        <w:pStyle w:val="Compact"/>
+        <w:numPr>
+          <w:ilvl w:val="0"/>
+          <w:numId w:val="1002"/>
+        </w:numPr>
+      </w:pPr>
+      <w:hyperlink w:anchor="X8ab444d8e3055774f5860153c1d45a8eb9a3cec">
+        <w:r>
+          <w:rPr>
+            <w:rStyle w:val="Hyperlink"/>
+          </w:rPr>
+          <w:t xml:space="preserve">Testing Strategy</w:t>
+        </w:r>
+      </w:hyperlink>
+    </w:p>
+    <w:p>
+      <w:pPr>
+        <w:pStyle w:val="Compact"/>
+        <w:numPr>
+          <w:ilvl w:val="0"/>
+          <w:numId w:val="1002"/>
+        </w:numPr>
+      </w:pPr>
+      <w:hyperlink w:anchor="X4104601c4a2ac55573998d143191a1bc283888b">
+        <w:r>
+          <w:rPr>
+            <w:rStyle w:val="Hyperlink"/>
+          </w:rPr>
+          <w:t xml:space="preserve">Quality Assurance Plan</w:t>
+        </w:r>
+      </w:hyperlink>
+    </w:p>
+    <w:p>
+      <w:pPr>
+        <w:pStyle w:val="Compact"/>
+        <w:numPr>
+          <w:ilvl w:val="0"/>
+          <w:numId w:val="1002"/>
+        </w:numPr>
+      </w:pPr>
+      <w:hyperlink w:anchor="X4f9d998372b875b89ba3654044a53a492003f26">
+        <w:r>
+          <w:rPr>
+            <w:rStyle w:val="Hyperlink"/>
+          </w:rPr>
+          <w:t xml:space="preserve">Configuration Management</w:t>
+        </w:r>
+      </w:hyperlink>
+    </w:p>
+    <w:p>
+      <w:pPr>
+        <w:pStyle w:val="Compact"/>
+        <w:numPr>
+          <w:ilvl w:val="0"/>
+          <w:numId w:val="1002"/>
+        </w:numPr>
+      </w:pPr>
+      <w:hyperlink w:anchor="X10ec23bd76c50fe757b1114add0012ea345cb63">
+        <w:r>
+          <w:rPr>
+            <w:rStyle w:val="Hyperlink"/>
+          </w:rPr>
+          <w:t xml:space="preserve">Release Management</w:t>
+        </w:r>
+      </w:hyperlink>
+    </w:p>
+    <w:p>
+      <w:pPr>
+        <w:pStyle w:val="Compact"/>
+        <w:numPr>
+          <w:ilvl w:val="0"/>
+          <w:numId w:val="1002"/>
+        </w:numPr>
+      </w:pPr>
+      <w:hyperlink w:anchor="X5f797ea3a8639423e17d0d384bccacdf35b49ad">
+        <w:r>
+          <w:rPr>
+            <w:rStyle w:val="Hyperlink"/>
+          </w:rPr>
+          <w:t xml:space="preserve">Risk Management</w:t>
+        </w:r>
+      </w:hyperlink>
+    </w:p>
+    <w:p>
+      <w:pPr>
+        <w:pStyle w:val="Compact"/>
+        <w:numPr>
+          <w:ilvl w:val="0"/>
+          <w:numId w:val="1002"/>
+        </w:numPr>
+      </w:pPr>
+      <w:hyperlink w:anchor="X7c127fed55bc99364e804d184ecf3110f2fe24c">
+        <w:r>
+          <w:rPr>
+            <w:rStyle w:val="Hyperlink"/>
+          </w:rPr>
+          <w:t xml:space="preserve">Issue Management</w:t>
+        </w:r>
+      </w:hyperlink>
+    </w:p>
+    <w:p>
+      <w:pPr>
+        <w:pStyle w:val="Compact"/>
+        <w:numPr>
+          <w:ilvl w:val="0"/>
+          <w:numId w:val="1002"/>
+        </w:numPr>
+      </w:pPr>
+      <w:hyperlink w:anchor="X17b137da2ab7cd7a2679e0634a46c594e956106">
+        <w:r>
+          <w:rPr>
+            <w:rStyle w:val="Hyperlink"/>
+          </w:rPr>
+          <w:t xml:space="preserve">Communication Plan</w:t>
+        </w:r>
+      </w:hyperlink>
+    </w:p>
+    <w:p>
+      <w:pPr>
+        <w:pStyle w:val="Compact"/>
+        <w:numPr>
+          <w:ilvl w:val="0"/>
+          <w:numId w:val="1002"/>
+        </w:numPr>
+      </w:pPr>
+      <w:hyperlink w:anchor="Xc1667bad2838613ad799ea9f5cdba61081d7f61">
+        <w:r>
+          <w:rPr>
+            <w:rStyle w:val="Hyperlink"/>
+          </w:rPr>
+          <w:t xml:space="preserve">Change Management</w:t>
+        </w:r>
+      </w:hyperlink>
+    </w:p>
+    <w:p>
+      <w:pPr>
+        <w:pStyle w:val="Compact"/>
+        <w:numPr>
+          <w:ilvl w:val="0"/>
+          <w:numId w:val="1002"/>
+        </w:numPr>
+      </w:pPr>
+      <w:hyperlink w:anchor="Xe0c21efbbf54bff1aef621db44d3f72082755a8">
+        <w:r>
+          <w:rPr>
+            <w:rStyle w:val="Hyperlink"/>
+          </w:rPr>
+          <w:t xml:space="preserve">Deployment Strategy</w:t>
+        </w:r>
+      </w:hyperlink>
+    </w:p>
+    <w:p>
+      <w:pPr>
+        <w:pStyle w:val="Compact"/>
+        <w:numPr>
+          <w:ilvl w:val="0"/>
+          <w:numId w:val="1002"/>
+        </w:numPr>
+      </w:pPr>
+      <w:hyperlink w:anchor="Xcaa1106376335f5b670877030f0b42385e0b021">
+        <w:r>
+          <w:rPr>
+            <w:rStyle w:val="Hyperlink"/>
+          </w:rPr>
+          <w:t xml:space="preserve">Backup and Recovery Strategy</w:t>
+        </w:r>
+      </w:hyperlink>
+    </w:p>
+    <w:p>
+      <w:pPr>
+        <w:pStyle w:val="Compact"/>
+        <w:numPr>
+          <w:ilvl w:val="0"/>
+          <w:numId w:val="1002"/>
+        </w:numPr>
+      </w:pPr>
+      <w:hyperlink w:anchor="Xc24e2f63330fbcd95a9d9d459af6d05d097a40f">
+        <w:r>
+          <w:rPr>
+            <w:rStyle w:val="Hyperlink"/>
+          </w:rPr>
+          <w:t xml:space="preserve">Monitoring Strategy</w:t>
+        </w:r>
+      </w:hyperlink>
+    </w:p>
+    <w:p>
+      <w:pPr>
+        <w:pStyle w:val="Compact"/>
+        <w:numPr>
+          <w:ilvl w:val="0"/>
+          <w:numId w:val="1002"/>
+        </w:numPr>
+      </w:pPr>
+      <w:hyperlink w:anchor="X62d5d21cd56884c64b466b96134167705d5da4b">
+        <w:r>
+          <w:rPr>
+            <w:rStyle w:val="Hyperlink"/>
+          </w:rPr>
+          <w:t xml:space="preserve">Security Management</w:t>
+        </w:r>
+      </w:hyperlink>
+    </w:p>
+    <w:p>
+      <w:pPr>
+        <w:pStyle w:val="Compact"/>
+        <w:numPr>
+          <w:ilvl w:val="0"/>
+          <w:numId w:val="1002"/>
+        </w:numPr>
+      </w:pPr>
+      <w:hyperlink w:anchor="X50ba4783dd86237f8c9ac8b21f022691915a64f">
+        <w:r>
+          <w:rPr>
+            <w:rStyle w:val="Hyperlink"/>
+          </w:rPr>
+          <w:t xml:space="preserve">Acceptance Process</w:t>
+        </w:r>
+      </w:hyperlink>
+    </w:p>
+    <w:p>
+      <w:pPr>
+        <w:pStyle w:val="Compact"/>
+        <w:numPr>
+          <w:ilvl w:val="0"/>
+          <w:numId w:val="1002"/>
+        </w:numPr>
+      </w:pPr>
+      <w:hyperlink w:anchor="Xf9f497fae0149d24face411099e20cd65ecbf75">
+        <w:r>
+          <w:rPr>
+            <w:rStyle w:val="Hyperlink"/>
+          </w:rPr>
+          <w:t xml:space="preserve">Maintenance Plan</w:t>
+        </w:r>
+      </w:hyperlink>
+    </w:p>
+    <w:p>
+      <w:pPr>
+        <w:pStyle w:val="Compact"/>
+        <w:numPr>
+          <w:ilvl w:val="0"/>
+          <w:numId w:val="1002"/>
+        </w:numPr>
+      </w:pPr>
+      <w:hyperlink w:anchor="X500c8d27e36a033cdfb0bc3a88e2cac8ee65ae8">
+        <w:r>
+          <w:rPr>
+            <w:rStyle w:val="Hyperlink"/>
+          </w:rPr>
+          <w:t xml:space="preserve">Future Roadmap</w:t>
+        </w:r>
+      </w:hyperlink>
+    </w:p>
+    <w:p>
+      <w:pPr>
+        <w:pStyle w:val="Compact"/>
+        <w:numPr>
+          <w:ilvl w:val="0"/>
+          <w:numId w:val="1002"/>
+        </w:numPr>
+      </w:pPr>
+      <w:hyperlink w:anchor="appendix-a--tooling--command-reference">
+        <w:r>
+          <w:rPr>
+            <w:rStyle w:val="Hyperlink"/>
+          </w:rPr>
+          <w:t xml:space="preserve">Appendix A — Tooling &amp; Command Reference</w:t>
+        </w:r>
+      </w:hyperlink>
+    </w:p>
+    <w:p>
+      <w:pPr>
+        <w:pStyle w:val="Compact"/>
+        <w:numPr>
+          <w:ilvl w:val="0"/>
+          <w:numId w:val="1002"/>
+        </w:numPr>
+      </w:pPr>
+      <w:hyperlink w:anchor="appendix-b--assumption-register">
+        <w:r>
+          <w:rPr>
+            <w:rStyle w:val="Hyperlink"/>
+          </w:rPr>
+          <w:t xml:space="preserve">Appendix B — Assumption Register</w:t>
+        </w:r>
+      </w:hyperlink>
+    </w:p>
+    <w:p>
+      <w:pPr>
+        <w:pStyle w:val="Compact"/>
+        <w:numPr>
+          <w:ilvl w:val="0"/>
+          <w:numId w:val="1002"/>
+        </w:numPr>
+      </w:pPr>
+      <w:hyperlink w:anchor="appendix-c--consistency-review-log">
+        <w:r>
+          <w:rPr>
+            <w:rStyle w:val="Hyperlink"/>
+          </w:rPr>
+          <w:t xml:space="preserve">Appendix C — Consistency Review Log</w:t>
+        </w:r>
+      </w:hyperlink>
     </w:p>
     <w:p>
       <w:r>
@@ -1395,16 +1796,192 @@
       </w:r>
     </w:p>
     <w:bookmarkEnd w:id="12"/>
-    <w:bookmarkStart w:id="16" w:name="Xe2821c3670825fa1daa3010381e179ed3462c8d"/>
+    <w:bookmarkStart w:id="13" w:name="X102b2e9de4183984340b81b0bb402a984d3925a"/>
     <w:p>
       <w:pPr>
         <w:pStyle w:val="Heading2"/>
       </w:pPr>
       <w:r>
+        <w:t xml:space="preserve">1. Executive Summary</w:t>
+      </w:r>
+    </w:p>
+    <w:p>
+      <w:pPr>
+        <w:pStyle w:val="FirstParagraph"/>
+      </w:pPr>
+      <w:r>
+        <w:t xml:space="preserve">SccIT is a production-intended, vertical-agnostic ITSM/ITAM platform. Its</w:t>
+      </w:r>
+      <w:r>
+        <w:t xml:space="preserve"> </w:t>
+      </w:r>
+      <w:r>
+        <w:rPr>
+          <w:b/>
+          <w:bCs/>
+        </w:rPr>
+        <w:t xml:space="preserve">foundation is already built and verified</w:t>
+      </w:r>
+      <w:r>
+        <w:t xml:space="preserve">: a fully Dockerized Laravel 13 + React 19 stack, a production-grade PostgreSQL 17 data layer (66 models, integrity enforced in the database), and a green CI pipeline (phases 0–7). The</w:t>
+      </w:r>
+      <w:r>
+        <w:t xml:space="preserve"> </w:t>
+      </w:r>
+      <w:r>
+        <w:rPr>
+          <w:b/>
+          <w:bCs/>
+        </w:rPr>
+        <w:t xml:space="preserve">requirements (SRS) and design (SDD) are approved.</w:t>
+      </w:r>
+      <w:r>
+        <w:t xml:space="preserve"> </w:t>
+      </w:r>
+      <w:r>
+        <w:t xml:space="preserve">This SPMP governs the remaining lifecycle: building the application layer across three phases —</w:t>
+      </w:r>
+      <w:r>
+        <w:t xml:space="preserve"> </w:t>
+      </w:r>
+      <w:r>
+        <w:rPr>
+          <w:b/>
+          <w:bCs/>
+        </w:rPr>
+        <w:t xml:space="preserve">P2 Core</w:t>
+      </w:r>
+      <w:r>
+        <w:t xml:space="preserve">,</w:t>
+      </w:r>
+      <w:r>
+        <w:t xml:space="preserve"> </w:t>
+      </w:r>
+      <w:r>
+        <w:rPr>
+          <w:b/>
+          <w:bCs/>
+        </w:rPr>
+        <w:t xml:space="preserve">P3 AI &amp; Knowledge Base</w:t>
+      </w:r>
+      <w:r>
+        <w:t xml:space="preserve">,</w:t>
+      </w:r>
+      <w:r>
+        <w:t xml:space="preserve"> </w:t>
+      </w:r>
+      <w:r>
+        <w:rPr>
+          <w:b/>
+          <w:bCs/>
+        </w:rPr>
+        <w:t xml:space="preserve">P4 Interactive Floor Plan &amp; Real-time</w:t>
+      </w:r>
+      <w:r>
+        <w:t xml:space="preserve"> </w:t>
+      </w:r>
+      <w:r>
+        <w:t xml:space="preserve">— followed by steady-state maintenance.</w:t>
+      </w:r>
+    </w:p>
+    <w:p>
+      <w:pPr>
+        <w:pStyle w:val="BodyText"/>
+      </w:pPr>
+      <w:r>
+        <w:t xml:space="preserve">The project runs an</w:t>
+      </w:r>
+      <w:r>
+        <w:t xml:space="preserve"> </w:t>
+      </w:r>
+      <w:r>
+        <w:rPr>
+          <w:b/>
+          <w:bCs/>
+        </w:rPr>
+        <w:t xml:space="preserve">iterative, phase-gated</w:t>
+      </w:r>
+      <w:r>
+        <w:t xml:space="preserve"> </w:t>
+      </w:r>
+      <w:r>
+        <w:t xml:space="preserve">model that matches the established working agreement: work proceeds in short sprints inside each phase, and</w:t>
+      </w:r>
+      <w:r>
+        <w:t xml:space="preserve"> </w:t>
+      </w:r>
+      <w:r>
+        <w:rPr>
+          <w:b/>
+          <w:bCs/>
+        </w:rPr>
+        <w:t xml:space="preserve">each phase ends at a client approval gate</w:t>
+      </w:r>
+      <w:r>
+        <w:t xml:space="preserve"> </w:t>
+      </w:r>
+      <w:r>
+        <w:t xml:space="preserve">before the next begins. Quality is non-negotiable and largely automated — every change passes the same gates CI already enforces (Pint, Larastan level 6, Pest; ESLint, Prettier, TypeScript, Vitest, build) — and correctness is backstopped by database constraints, so the “done” bar is objective and repeatable.</w:t>
+      </w:r>
+    </w:p>
+    <w:p>
+      <w:pPr>
+        <w:pStyle w:val="BodyText"/>
+      </w:pPr>
+      <w:r>
+        <w:t xml:space="preserve">Management is deliberately lightweight but disciplined: trunk-based Git with short-lived reviewed branches, a WBS decomposed by the SDD’s domains, milestones defined by</w:t>
+      </w:r>
+      <w:r>
+        <w:t xml:space="preserve"> </w:t>
+      </w:r>
+      <w:r>
+        <w:rPr>
+          <w:i/>
+          <w:iCs/>
+        </w:rPr>
+        <w:t xml:space="preserve">acceptance</w:t>
+      </w:r>
+      <w:r>
+        <w:t xml:space="preserve"> </w:t>
+      </w:r>
+      <w:r>
+        <w:t xml:space="preserve">rather than dates, and a risk register that inherits the SRS’s technical risks and adds project-level ones (schedule, bus-factor, AI-provider dependency, client-gate availability). Because the team size and cadence are not yet fixed, all calendar figures are presented as clearly-labelled assumptions to be confirmed at approval; the</w:t>
+      </w:r>
+      <w:r>
+        <w:t xml:space="preserve"> </w:t>
+      </w:r>
+      <w:r>
+        <w:rPr>
+          <w:i/>
+          <w:iCs/>
+        </w:rPr>
+        <w:t xml:space="preserve">structure</w:t>
+      </w:r>
+      <w:r>
+        <w:t xml:space="preserve"> </w:t>
+      </w:r>
+      <w:r>
+        <w:t xml:space="preserve">of the plan (sequencing, gates, quality bar, deliverables) is firm.</w:t>
+      </w:r>
+    </w:p>
+    <w:p>
+      <w:r>
+        <w:pict>
+          <v:rect style="width:0;height:1.5pt" o:hralign="center" o:hrstd="t" o:hr="t"/>
+        </w:pict>
+      </w:r>
+    </w:p>
+    <w:bookmarkEnd w:id="13"/>
+    <w:bookmarkStart w:id="17" w:name="Xe2821c3670825fa1daa3010381e179ed3462c8d"/>
+    <w:p>
+      <w:pPr>
+        <w:pStyle w:val="Heading2"/>
+      </w:pPr>
+      <w:r>
         <w:t xml:space="preserve">2. Project Overview</w:t>
       </w:r>
     </w:p>
-    <w:bookmarkStart w:id="13" w:name="X4dcc8a083d7c3ccfb782aaf03921f6e7e8b460d"/>
+    <w:bookmarkStart w:id="14" w:name="X4dcc8a083d7c3ccfb782aaf03921f6e7e8b460d"/>
     <w:p>
       <w:pPr>
         <w:pStyle w:val="Heading3"/>
@@ -1446,8 +2023,8 @@
         <w:t xml:space="preserve">).</w:t>
       </w:r>
     </w:p>
-    <w:bookmarkEnd w:id="13"/>
-    <w:bookmarkStart w:id="14" w:name="X5f5ef275981b95770f4b551d3070337d9a21e29"/>
+    <w:bookmarkEnd w:id="14"/>
+    <w:bookmarkStart w:id="15" w:name="X5f5ef275981b95770f4b551d3070337d9a21e29"/>
     <w:p>
       <w:pPr>
         <w:pStyle w:val="Heading3"/>
@@ -1769,8 +2346,8 @@
         </w:tc>
       </w:tr>
     </w:tbl>
-    <w:bookmarkEnd w:id="14"/>
-    <w:bookmarkStart w:id="15" w:name="X66643572047ec3cd6539e2887a02619d2e5e4ed"/>
+    <w:bookmarkEnd w:id="15"/>
+    <w:bookmarkStart w:id="16" w:name="X66643572047ec3cd6539e2887a02619d2e5e4ed"/>
     <w:p>
       <w:pPr>
         <w:pStyle w:val="Heading3"/>
@@ -1794,9 +2371,9 @@
         </w:pict>
       </w:r>
     </w:p>
-    <w:bookmarkEnd w:id="15"/>
     <w:bookmarkEnd w:id="16"/>
-    <w:bookmarkStart w:id="17" w:name="X75c7fc3ae3409a2dc800748cd65d00ae33b40c8"/>
+    <w:bookmarkEnd w:id="17"/>
+    <w:bookmarkStart w:id="18" w:name="X75c7fc3ae3409a2dc800748cd65d00ae33b40c8"/>
     <w:p>
       <w:pPr>
         <w:pStyle w:val="Heading2"/>
@@ -2209,8 +2786,8 @@
         </w:pict>
       </w:r>
     </w:p>
-    <w:bookmarkEnd w:id="17"/>
-    <w:bookmarkStart w:id="21" w:name="X6613e4245a75e88013480f423ae1cd188d10e18"/>
+    <w:bookmarkEnd w:id="18"/>
+    <w:bookmarkStart w:id="22" w:name="X6613e4245a75e88013480f423ae1cd188d10e18"/>
     <w:p>
       <w:pPr>
         <w:pStyle w:val="Heading2"/>
@@ -2219,7 +2796,7 @@
         <w:t xml:space="preserve">4. Scope</w:t>
       </w:r>
     </w:p>
-    <w:bookmarkStart w:id="18" w:name="X65a9a34fd913fa5cc72b495b1cfed5f90648559"/>
+    <w:bookmarkStart w:id="19" w:name="X65a9a34fd913fa5cc72b495b1cfed5f90648559"/>
     <w:p>
       <w:pPr>
         <w:pStyle w:val="Heading3"/>
@@ -2252,8 +2829,8 @@
         <w:t xml:space="preserve">the product requirements (SRS) or the technical design (SDD).</w:t>
       </w:r>
     </w:p>
-    <w:bookmarkEnd w:id="18"/>
-    <w:bookmarkStart w:id="19" w:name="X898fd688cabdbaf98bd10c7ea3f47d58217bb89"/>
+    <w:bookmarkEnd w:id="19"/>
+    <w:bookmarkStart w:id="20" w:name="X898fd688cabdbaf98bd10c7ea3f47d58217bb89"/>
     <w:p>
       <w:pPr>
         <w:pStyle w:val="Heading3"/>
@@ -2327,8 +2904,8 @@
         <w:t xml:space="preserve">).</w:t>
       </w:r>
     </w:p>
-    <w:bookmarkEnd w:id="19"/>
-    <w:bookmarkStart w:id="20" w:name="Xf90975628fa0e1afbe77932935c2cf4e62df9ff"/>
+    <w:bookmarkEnd w:id="20"/>
+    <w:bookmarkStart w:id="21" w:name="Xf90975628fa0e1afbe77932935c2cf4e62df9ff"/>
     <w:p>
       <w:pPr>
         <w:pStyle w:val="Heading3"/>
@@ -2389,9 +2966,9 @@
         </w:pict>
       </w:r>
     </w:p>
-    <w:bookmarkEnd w:id="20"/>
     <w:bookmarkEnd w:id="21"/>
-    <w:bookmarkStart w:id="22" w:name="Xddc721b7327e6412d03edb41e5e9a078bcd2552"/>
+    <w:bookmarkEnd w:id="22"/>
+    <w:bookmarkStart w:id="23" w:name="Xddc721b7327e6412d03edb41e5e9a078bcd2552"/>
     <w:p>
       <w:pPr>
         <w:pStyle w:val="Heading2"/>
@@ -3228,8 +3805,8 @@
         </w:pict>
       </w:r>
     </w:p>
-    <w:bookmarkEnd w:id="22"/>
-    <w:bookmarkStart w:id="23" w:name="Xa536954d252a5395ba1c91301751b3bc36919b0"/>
+    <w:bookmarkEnd w:id="23"/>
+    <w:bookmarkStart w:id="24" w:name="Xa536954d252a5395ba1c91301751b3bc36919b0"/>
     <w:p>
       <w:pPr>
         <w:pStyle w:val="Heading2"/>
@@ -3484,8 +4061,8 @@
         </w:pict>
       </w:r>
     </w:p>
-    <w:bookmarkEnd w:id="23"/>
-    <w:bookmarkStart w:id="24" w:name="X58f9195d3e82ed0424ae8027163b82dea516217"/>
+    <w:bookmarkEnd w:id="24"/>
+    <w:bookmarkStart w:id="25" w:name="X58f9195d3e82ed0424ae8027163b82dea516217"/>
     <w:p>
       <w:pPr>
         <w:pStyle w:val="Heading2"/>
@@ -3959,8 +4536,8 @@
         </w:pict>
       </w:r>
     </w:p>
-    <w:bookmarkEnd w:id="24"/>
-    <w:bookmarkStart w:id="29" w:name="Xc1c33d12d83ad80ee746dc7588d82c573556d58"/>
+    <w:bookmarkEnd w:id="25"/>
+    <w:bookmarkStart w:id="30" w:name="Xc1c33d12d83ad80ee746dc7588d82c573556d58"/>
     <w:p>
       <w:pPr>
         <w:pStyle w:val="Heading2"/>
@@ -3969,7 +4546,7 @@
         <w:t xml:space="preserve">8. Development Methodology</w:t>
       </w:r>
     </w:p>
-    <w:bookmarkStart w:id="25" w:name="Xe59a3a3ae496f4d359dbdbeb9e3fc8cfd16e1a8"/>
+    <w:bookmarkStart w:id="26" w:name="Xe59a3a3ae496f4d359dbdbeb9e3fc8cfd16e1a8"/>
     <w:p>
       <w:pPr>
         <w:pStyle w:val="Heading3"/>
@@ -3998,7 +4575,7 @@
         <w:pStyle w:val="Compact"/>
         <w:numPr>
           <w:ilvl w:val="0"/>
-          <w:numId w:val="1002"/>
+          <w:numId w:val="1003"/>
         </w:numPr>
       </w:pPr>
       <w:r>
@@ -4020,7 +4597,7 @@
         <w:pStyle w:val="Compact"/>
         <w:numPr>
           <w:ilvl w:val="0"/>
-          <w:numId w:val="1002"/>
+          <w:numId w:val="1003"/>
         </w:numPr>
       </w:pPr>
       <w:r>
@@ -4069,7 +4646,7 @@
         <w:pStyle w:val="Compact"/>
         <w:numPr>
           <w:ilvl w:val="0"/>
-          <w:numId w:val="1002"/>
+          <w:numId w:val="1003"/>
         </w:numPr>
       </w:pPr>
       <w:r>
@@ -4086,8 +4663,8 @@
         <w:t xml:space="preserve">for defects/small tasks between sprint boundaries.</w:t>
       </w:r>
     </w:p>
-    <w:bookmarkEnd w:id="25"/>
-    <w:bookmarkStart w:id="26" w:name="X532e9485108360af23ac134250d2669bbde461c"/>
+    <w:bookmarkEnd w:id="26"/>
+    <w:bookmarkStart w:id="27" w:name="X532e9485108360af23ac134250d2669bbde461c"/>
     <w:p>
       <w:pPr>
         <w:pStyle w:val="Heading3"/>
@@ -4115,8 +4692,8 @@
         <w:t xml:space="preserve">); design approach clear (SDD reference); dependencies available; test approach agreed.</w:t>
       </w:r>
     </w:p>
-    <w:bookmarkEnd w:id="26"/>
-    <w:bookmarkStart w:id="27" w:name="Xfdd4d7f6e8b72d1cefddd4a35b16477800bedef"/>
+    <w:bookmarkEnd w:id="27"/>
+    <w:bookmarkStart w:id="28" w:name="Xfdd4d7f6e8b72d1cefddd4a35b16477800bedef"/>
     <w:p>
       <w:pPr>
         <w:pStyle w:val="Heading3"/>
@@ -4149,8 +4726,8 @@
         <w:t xml:space="preserve">(all gates); domain coverage target met; API documented (OpenAPI); accessibility checks pass for UI; security-sensitive paths reviewed; docs/ADR updated; peer-reviewed and merged; demonstrated against acceptance criteria.</w:t>
       </w:r>
     </w:p>
-    <w:bookmarkEnd w:id="27"/>
-    <w:bookmarkStart w:id="28" w:name="X5cdaa98babd92e3020da3fd3ecfbb2a07f708eb"/>
+    <w:bookmarkEnd w:id="28"/>
+    <w:bookmarkStart w:id="29" w:name="X5cdaa98babd92e3020da3fd3ecfbb2a07f708eb"/>
     <w:p>
       <w:pPr>
         <w:pStyle w:val="Heading3"/>
@@ -4201,9 +4778,9 @@
         </w:pict>
       </w:r>
     </w:p>
-    <w:bookmarkEnd w:id="28"/>
     <w:bookmarkEnd w:id="29"/>
-    <w:bookmarkStart w:id="30" w:name="X8386f55e5b192f354be1fd120ec62ef2ff2359e"/>
+    <w:bookmarkEnd w:id="30"/>
+    <w:bookmarkStart w:id="31" w:name="X8386f55e5b192f354be1fd120ec62ef2ff2359e"/>
     <w:p>
       <w:pPr>
         <w:pStyle w:val="Heading2"/>
@@ -4217,7 +4794,7 @@
         <w:pStyle w:val="Compact"/>
         <w:numPr>
           <w:ilvl w:val="0"/>
-          <w:numId w:val="1003"/>
+          <w:numId w:val="1004"/>
         </w:numPr>
       </w:pPr>
       <w:r>
@@ -4250,7 +4827,7 @@
         <w:pStyle w:val="Compact"/>
         <w:numPr>
           <w:ilvl w:val="0"/>
-          <w:numId w:val="1003"/>
+          <w:numId w:val="1004"/>
         </w:numPr>
       </w:pPr>
       <w:r>
@@ -4284,7 +4861,7 @@
         <w:pStyle w:val="Compact"/>
         <w:numPr>
           <w:ilvl w:val="0"/>
-          <w:numId w:val="1003"/>
+          <w:numId w:val="1004"/>
         </w:numPr>
       </w:pPr>
       <w:r>
@@ -4306,7 +4883,7 @@
         <w:pStyle w:val="Compact"/>
         <w:numPr>
           <w:ilvl w:val="0"/>
-          <w:numId w:val="1003"/>
+          <w:numId w:val="1004"/>
         </w:numPr>
       </w:pPr>
       <w:r>
@@ -4385,8 +4962,8 @@
         </w:pict>
       </w:r>
     </w:p>
-    <w:bookmarkEnd w:id="30"/>
-    <w:bookmarkStart w:id="31" w:name="X11c27c951ee620c48b2c24bff8bc714594e6fa6"/>
+    <w:bookmarkEnd w:id="31"/>
+    <w:bookmarkStart w:id="32" w:name="X11c27c951ee620c48b2c24bff8bc714594e6fa6"/>
     <w:p>
       <w:pPr>
         <w:pStyle w:val="Heading2"/>
@@ -6070,8 +6647,8 @@
         </w:pict>
       </w:r>
     </w:p>
-    <w:bookmarkEnd w:id="31"/>
-    <w:bookmarkStart w:id="32" w:name="X9b77de9594754149cd6e99d9256bc8441b2fc76"/>
+    <w:bookmarkEnd w:id="32"/>
+    <w:bookmarkStart w:id="33" w:name="X9b77de9594754149cd6e99d9256bc8441b2fc76"/>
     <w:p>
       <w:pPr>
         <w:pStyle w:val="Heading2"/>
@@ -6564,8 +7141,8 @@
         </w:pict>
       </w:r>
     </w:p>
-    <w:bookmarkEnd w:id="32"/>
-    <w:bookmarkStart w:id="33" w:name="X5cb12fe4ddcbbb458aceeecbc9e3be22fde76b5"/>
+    <w:bookmarkEnd w:id="33"/>
+    <w:bookmarkStart w:id="34" w:name="X5cb12fe4ddcbbb458aceeecbc9e3be22fde76b5"/>
     <w:p>
       <w:pPr>
         <w:pStyle w:val="Heading2"/>
@@ -7075,8 +7652,8 @@
         </w:pict>
       </w:r>
     </w:p>
-    <w:bookmarkEnd w:id="33"/>
-    <w:bookmarkStart w:id="34" w:name="X8f3e2a7a103d4f20361eebc5a710b5a050dfb71"/>
+    <w:bookmarkEnd w:id="34"/>
+    <w:bookmarkStart w:id="35" w:name="X8f3e2a7a103d4f20361eebc5a710b5a050dfb71"/>
     <w:p>
       <w:pPr>
         <w:pStyle w:val="Heading2"/>
@@ -7123,7 +7700,7 @@
         <w:pStyle w:val="Compact"/>
         <w:numPr>
           <w:ilvl w:val="0"/>
-          <w:numId w:val="1004"/>
+          <w:numId w:val="1005"/>
         </w:numPr>
       </w:pPr>
       <w:r>
@@ -7181,7 +7758,7 @@
         <w:pStyle w:val="Compact"/>
         <w:numPr>
           <w:ilvl w:val="0"/>
-          <w:numId w:val="1004"/>
+          <w:numId w:val="1005"/>
         </w:numPr>
       </w:pPr>
       <w:r>
@@ -7281,7 +7858,7 @@
         <w:pStyle w:val="Compact"/>
         <w:numPr>
           <w:ilvl w:val="0"/>
-          <w:numId w:val="1004"/>
+          <w:numId w:val="1005"/>
         </w:numPr>
       </w:pPr>
       <w:r>
@@ -7330,7 +7907,7 @@
         <w:pStyle w:val="Compact"/>
         <w:numPr>
           <w:ilvl w:val="0"/>
-          <w:numId w:val="1004"/>
+          <w:numId w:val="1005"/>
         </w:numPr>
       </w:pPr>
       <w:r>
@@ -7361,7 +7938,7 @@
         <w:pStyle w:val="Compact"/>
         <w:numPr>
           <w:ilvl w:val="0"/>
-          <w:numId w:val="1004"/>
+          <w:numId w:val="1005"/>
         </w:numPr>
       </w:pPr>
       <w:r>
@@ -7443,8 +8020,8 @@
         </w:pict>
       </w:r>
     </w:p>
-    <w:bookmarkEnd w:id="34"/>
-    <w:bookmarkStart w:id="35" w:name="Xcbc3b83026a23e6e1c3cb3f87441c14385b9a7b"/>
+    <w:bookmarkEnd w:id="35"/>
+    <w:bookmarkStart w:id="36" w:name="Xcbc3b83026a23e6e1c3cb3f87441c14385b9a7b"/>
     <w:p>
       <w:pPr>
         <w:pStyle w:val="Heading2"/>
@@ -7458,7 +8035,7 @@
         <w:pStyle w:val="Compact"/>
         <w:numPr>
           <w:ilvl w:val="0"/>
-          <w:numId w:val="1005"/>
+          <w:numId w:val="1006"/>
         </w:numPr>
       </w:pPr>
       <w:r>
@@ -7510,7 +8087,7 @@
         <w:pStyle w:val="Compact"/>
         <w:numPr>
           <w:ilvl w:val="0"/>
-          <w:numId w:val="1005"/>
+          <w:numId w:val="1006"/>
         </w:numPr>
       </w:pPr>
       <w:r>
@@ -7580,7 +8157,7 @@
         <w:pStyle w:val="Compact"/>
         <w:numPr>
           <w:ilvl w:val="0"/>
-          <w:numId w:val="1005"/>
+          <w:numId w:val="1006"/>
         </w:numPr>
       </w:pPr>
       <w:r>
@@ -7628,7 +8205,7 @@
         <w:pStyle w:val="Compact"/>
         <w:numPr>
           <w:ilvl w:val="0"/>
-          <w:numId w:val="1005"/>
+          <w:numId w:val="1006"/>
         </w:numPr>
       </w:pPr>
       <w:r>
@@ -7695,7 +8272,7 @@
         <w:pStyle w:val="Compact"/>
         <w:numPr>
           <w:ilvl w:val="0"/>
-          <w:numId w:val="1005"/>
+          <w:numId w:val="1006"/>
         </w:numPr>
       </w:pPr>
       <w:r>
@@ -7732,7 +8309,7 @@
         <w:pStyle w:val="Compact"/>
         <w:numPr>
           <w:ilvl w:val="0"/>
-          <w:numId w:val="1005"/>
+          <w:numId w:val="1006"/>
         </w:numPr>
       </w:pPr>
       <w:r>
@@ -7774,7 +8351,7 @@
         <w:pStyle w:val="Compact"/>
         <w:numPr>
           <w:ilvl w:val="0"/>
-          <w:numId w:val="1005"/>
+          <w:numId w:val="1006"/>
         </w:numPr>
       </w:pPr>
       <w:r>
@@ -7822,8 +8399,8 @@
         </w:pict>
       </w:r>
     </w:p>
-    <w:bookmarkEnd w:id="35"/>
-    <w:bookmarkStart w:id="36" w:name="X1ea1cd2b8b0feb2821e5b74f2fdb6f6f152a418"/>
+    <w:bookmarkEnd w:id="36"/>
+    <w:bookmarkStart w:id="37" w:name="X1ea1cd2b8b0feb2821e5b74f2fdb6f6f152a418"/>
     <w:p>
       <w:pPr>
         <w:pStyle w:val="Heading2"/>
@@ -8297,8 +8874,8 @@
         </w:pict>
       </w:r>
     </w:p>
-    <w:bookmarkEnd w:id="36"/>
-    <w:bookmarkStart w:id="37" w:name="X9907c49effc2748f3ea89d9d7f9abb59407184a"/>
+    <w:bookmarkEnd w:id="37"/>
+    <w:bookmarkStart w:id="38" w:name="X9907c49effc2748f3ea89d9d7f9abb59407184a"/>
     <w:p>
       <w:pPr>
         <w:pStyle w:val="Heading2"/>
@@ -8312,7 +8889,7 @@
         <w:pStyle w:val="Compact"/>
         <w:numPr>
           <w:ilvl w:val="0"/>
-          <w:numId w:val="1006"/>
+          <w:numId w:val="1007"/>
         </w:numPr>
       </w:pPr>
       <w:r>
@@ -8334,7 +8911,7 @@
         <w:pStyle w:val="Compact"/>
         <w:numPr>
           <w:ilvl w:val="0"/>
-          <w:numId w:val="1006"/>
+          <w:numId w:val="1007"/>
         </w:numPr>
       </w:pPr>
       <w:r>
@@ -8356,7 +8933,7 @@
         <w:pStyle w:val="Compact"/>
         <w:numPr>
           <w:ilvl w:val="0"/>
-          <w:numId w:val="1006"/>
+          <w:numId w:val="1007"/>
         </w:numPr>
       </w:pPr>
       <w:r>
@@ -8389,7 +8966,7 @@
         <w:pStyle w:val="Compact"/>
         <w:numPr>
           <w:ilvl w:val="0"/>
-          <w:numId w:val="1006"/>
+          <w:numId w:val="1007"/>
         </w:numPr>
       </w:pPr>
       <w:r>
@@ -8439,7 +9016,7 @@
         <w:pStyle w:val="Compact"/>
         <w:numPr>
           <w:ilvl w:val="0"/>
-          <w:numId w:val="1006"/>
+          <w:numId w:val="1007"/>
         </w:numPr>
       </w:pPr>
       <w:r>
@@ -8463,8 +9040,8 @@
         </w:pict>
       </w:r>
     </w:p>
-    <w:bookmarkEnd w:id="37"/>
-    <w:bookmarkStart w:id="38" w:name="X97180518543c19c1ef6861fd219454448064f99"/>
+    <w:bookmarkEnd w:id="38"/>
+    <w:bookmarkStart w:id="39" w:name="X97180518543c19c1ef6861fd219454448064f99"/>
     <w:p>
       <w:pPr>
         <w:pStyle w:val="Heading2"/>
@@ -8952,8 +9529,8 @@
         </w:pict>
       </w:r>
     </w:p>
-    <w:bookmarkEnd w:id="38"/>
-    <w:bookmarkStart w:id="39" w:name="X8ab444d8e3055774f5860153c1d45a8eb9a3cec"/>
+    <w:bookmarkEnd w:id="39"/>
+    <w:bookmarkStart w:id="40" w:name="X8ab444d8e3055774f5860153c1d45a8eb9a3cec"/>
     <w:p>
       <w:pPr>
         <w:pStyle w:val="Heading2"/>
@@ -9569,7 +10146,7 @@
         <w:pStyle w:val="Compact"/>
         <w:numPr>
           <w:ilvl w:val="0"/>
-          <w:numId w:val="1007"/>
+          <w:numId w:val="1008"/>
         </w:numPr>
       </w:pPr>
       <w:r>
@@ -9602,7 +10179,7 @@
         <w:pStyle w:val="Compact"/>
         <w:numPr>
           <w:ilvl w:val="0"/>
-          <w:numId w:val="1007"/>
+          <w:numId w:val="1008"/>
         </w:numPr>
       </w:pPr>
       <w:r>
@@ -9630,69 +10207,6 @@
       </w:r>
       <w:r>
         <w:t xml:space="preserve">.</w:t>
-      </w:r>
-    </w:p>
-    <w:p>
-      <w:pPr>
-        <w:pStyle w:val="Compact"/>
-        <w:numPr>
-          <w:ilvl w:val="0"/>
-          <w:numId w:val="1007"/>
-        </w:numPr>
-      </w:pPr>
-      <w:r>
-        <w:rPr>
-          <w:b/>
-          <w:bCs/>
-        </w:rPr>
-        <w:t xml:space="preserve">Backend tests</w:t>
-      </w:r>
-      <w:r>
-        <w:t xml:space="preserve"> </w:t>
-      </w:r>
-      <w:r>
-        <w:t xml:space="preserve">run against the dedicated</w:t>
-      </w:r>
-      <w:r>
-        <w:t xml:space="preserve"> </w:t>
-      </w:r>
-      <w:r>
-        <w:rPr>
-          <w:rStyle w:val="VerbatimChar"/>
-        </w:rPr>
-        <w:t xml:space="preserve">school_it_service_management_test</w:t>
-      </w:r>
-      <w:r>
-        <w:t xml:space="preserve"> </w:t>
-      </w:r>
-      <w:r>
-        <w:t xml:space="preserve">DB (</w:t>
-      </w:r>
-      <w:r>
-        <w:rPr>
-          <w:rStyle w:val="VerbatimChar"/>
-        </w:rPr>
-        <w:t xml:space="preserve">phpunit.xml</w:t>
-      </w:r>
-      <w:r>
-        <w:t xml:space="preserve">), identical to CI.</w:t>
-      </w:r>
-    </w:p>
-    <w:p>
-      <w:r>
-        <w:pict>
-          <v:rect style="width:0;height:1.5pt" o:hralign="center" o:hrstd="t" o:hr="t"/>
-        </w:pict>
-      </w:r>
-    </w:p>
-    <w:bookmarkEnd w:id="39"/>
-    <w:bookmarkStart w:id="40" w:name="X4104601c4a2ac55573998d143191a1bc283888b"/>
-    <w:p>
-      <w:pPr>
-        <w:pStyle w:val="Heading2"/>
-      </w:pPr>
-      <w:r>
-        <w:t xml:space="preserve">19. Quality Assurance Plan</w:t>
       </w:r>
     </w:p>
     <w:p>
@@ -9708,37 +10222,54 @@
           <w:b/>
           <w:bCs/>
         </w:rPr>
-        <w:t xml:space="preserve">Prevention over detection:</w:t>
-      </w:r>
-      <w:r>
-        <w:t xml:space="preserve"> </w:t>
-      </w:r>
-      <w:r>
-        <w:t xml:space="preserve">the same gates run locally (</w:t>
+        <w:t xml:space="preserve">Backend tests</w:t>
+      </w:r>
+      <w:r>
+        <w:t xml:space="preserve"> </w:t>
+      </w:r>
+      <w:r>
+        <w:t xml:space="preserve">run against the dedicated</w:t>
+      </w:r>
+      <w:r>
+        <w:t xml:space="preserve"> </w:t>
       </w:r>
       <w:r>
         <w:rPr>
           <w:rStyle w:val="VerbatimChar"/>
         </w:rPr>
-        <w:t xml:space="preserve">make lint &amp;&amp; make test</w:t>
-      </w:r>
-      <w:r>
-        <w:t xml:space="preserve">) and in CI on every push/PR to</w:t>
-      </w:r>
-      <w:r>
-        <w:t xml:space="preserve"> </w:t>
+        <w:t xml:space="preserve">school_it_service_management_test</w:t>
+      </w:r>
+      <w:r>
+        <w:t xml:space="preserve"> </w:t>
+      </w:r>
+      <w:r>
+        <w:t xml:space="preserve">DB (</w:t>
       </w:r>
       <w:r>
         <w:rPr>
           <w:rStyle w:val="VerbatimChar"/>
         </w:rPr>
-        <w:t xml:space="preserve">main</w:t>
-      </w:r>
-      <w:r>
-        <w:t xml:space="preserve"> </w:t>
-      </w:r>
-      <w:r>
-        <w:t xml:space="preserve">— no change merges without them.</w:t>
+        <w:t xml:space="preserve">phpunit.xml</w:t>
+      </w:r>
+      <w:r>
+        <w:t xml:space="preserve">), identical to CI.</w:t>
+      </w:r>
+    </w:p>
+    <w:p>
+      <w:r>
+        <w:pict>
+          <v:rect style="width:0;height:1.5pt" o:hralign="center" o:hrstd="t" o:hr="t"/>
+        </w:pict>
+      </w:r>
+    </w:p>
+    <w:bookmarkEnd w:id="40"/>
+    <w:bookmarkStart w:id="41" w:name="X4104601c4a2ac55573998d143191a1bc283888b"/>
+    <w:p>
+      <w:pPr>
+        <w:pStyle w:val="Heading2"/>
+      </w:pPr>
+      <w:r>
+        <w:t xml:space="preserve">19. Quality Assurance Plan</w:t>
       </w:r>
     </w:p>
     <w:p>
@@ -9746,7 +10277,53 @@
         <w:pStyle w:val="Compact"/>
         <w:numPr>
           <w:ilvl w:val="0"/>
-          <w:numId w:val="1008"/>
+          <w:numId w:val="1009"/>
+        </w:numPr>
+      </w:pPr>
+      <w:r>
+        <w:rPr>
+          <w:b/>
+          <w:bCs/>
+        </w:rPr>
+        <w:t xml:space="preserve">Prevention over detection:</w:t>
+      </w:r>
+      <w:r>
+        <w:t xml:space="preserve"> </w:t>
+      </w:r>
+      <w:r>
+        <w:t xml:space="preserve">the same gates run locally (</w:t>
+      </w:r>
+      <w:r>
+        <w:rPr>
+          <w:rStyle w:val="VerbatimChar"/>
+        </w:rPr>
+        <w:t xml:space="preserve">make lint &amp;&amp; make test</w:t>
+      </w:r>
+      <w:r>
+        <w:t xml:space="preserve">) and in CI on every push/PR to</w:t>
+      </w:r>
+      <w:r>
+        <w:t xml:space="preserve"> </w:t>
+      </w:r>
+      <w:r>
+        <w:rPr>
+          <w:rStyle w:val="VerbatimChar"/>
+        </w:rPr>
+        <w:t xml:space="preserve">main</w:t>
+      </w:r>
+      <w:r>
+        <w:t xml:space="preserve"> </w:t>
+      </w:r>
+      <w:r>
+        <w:t xml:space="preserve">— no change merges without them.</w:t>
+      </w:r>
+    </w:p>
+    <w:p>
+      <w:pPr>
+        <w:pStyle w:val="Compact"/>
+        <w:numPr>
+          <w:ilvl w:val="0"/>
+          <w:numId w:val="1009"/>
         </w:numPr>
       </w:pPr>
       <w:r>
@@ -9793,7 +10370,7 @@
         <w:pStyle w:val="Compact"/>
         <w:numPr>
           <w:ilvl w:val="0"/>
-          <w:numId w:val="1008"/>
+          <w:numId w:val="1009"/>
         </w:numPr>
       </w:pPr>
       <w:r>
@@ -9840,7 +10417,7 @@
         <w:pStyle w:val="Compact"/>
         <w:numPr>
           <w:ilvl w:val="0"/>
-          <w:numId w:val="1008"/>
+          <w:numId w:val="1009"/>
         </w:numPr>
       </w:pPr>
       <w:r>
@@ -9862,7 +10439,7 @@
         <w:pStyle w:val="Compact"/>
         <w:numPr>
           <w:ilvl w:val="0"/>
-          <w:numId w:val="1008"/>
+          <w:numId w:val="1009"/>
         </w:numPr>
       </w:pPr>
       <w:r>
@@ -9884,7 +10461,7 @@
         <w:pStyle w:val="Compact"/>
         <w:numPr>
           <w:ilvl w:val="0"/>
-          <w:numId w:val="1008"/>
+          <w:numId w:val="1009"/>
         </w:numPr>
       </w:pPr>
       <w:r>
@@ -9937,8 +10514,8 @@
         </w:pict>
       </w:r>
     </w:p>
-    <w:bookmarkEnd w:id="40"/>
-    <w:bookmarkStart w:id="41" w:name="X4f9d998372b875b89ba3654044a53a492003f26"/>
+    <w:bookmarkEnd w:id="41"/>
+    <w:bookmarkStart w:id="42" w:name="X4f9d998372b875b89ba3654044a53a492003f26"/>
     <w:p>
       <w:pPr>
         <w:pStyle w:val="Heading2"/>
@@ -9952,7 +10529,7 @@
         <w:pStyle w:val="Compact"/>
         <w:numPr>
           <w:ilvl w:val="0"/>
-          <w:numId w:val="1009"/>
+          <w:numId w:val="1010"/>
         </w:numPr>
       </w:pPr>
       <w:r>
@@ -10014,7 +10591,7 @@
         <w:pStyle w:val="Compact"/>
         <w:numPr>
           <w:ilvl w:val="0"/>
-          <w:numId w:val="1009"/>
+          <w:numId w:val="1010"/>
         </w:numPr>
       </w:pPr>
       <w:r>
@@ -10189,7 +10766,7 @@
         <w:pStyle w:val="Compact"/>
         <w:numPr>
           <w:ilvl w:val="0"/>
-          <w:numId w:val="1009"/>
+          <w:numId w:val="1010"/>
         </w:numPr>
       </w:pPr>
       <w:r>
@@ -10265,7 +10842,7 @@
         <w:pStyle w:val="Compact"/>
         <w:numPr>
           <w:ilvl w:val="0"/>
-          <w:numId w:val="1009"/>
+          <w:numId w:val="1010"/>
         </w:numPr>
       </w:pPr>
       <w:r>
@@ -10332,7 +10909,7 @@
         <w:pStyle w:val="Compact"/>
         <w:numPr>
           <w:ilvl w:val="0"/>
-          <w:numId w:val="1009"/>
+          <w:numId w:val="1010"/>
         </w:numPr>
       </w:pPr>
       <w:r>
@@ -10425,7 +11002,7 @@
         <w:pStyle w:val="Compact"/>
         <w:numPr>
           <w:ilvl w:val="0"/>
-          <w:numId w:val="1009"/>
+          <w:numId w:val="1010"/>
         </w:numPr>
       </w:pPr>
       <w:r>
@@ -10464,45 +11041,6 @@
       </w:r>
       <w:r>
         <w:t xml:space="preserve">(multi-stage: development/production) are versioned artifacts.</w:t>
-      </w:r>
-    </w:p>
-    <w:p>
-      <w:pPr>
-        <w:pStyle w:val="Compact"/>
-        <w:numPr>
-          <w:ilvl w:val="0"/>
-          <w:numId w:val="1009"/>
-        </w:numPr>
-      </w:pPr>
-      <w:r>
-        <w:rPr>
-          <w:b/>
-          <w:bCs/>
-        </w:rPr>
-        <w:t xml:space="preserve">Configuration items baselined:</w:t>
-      </w:r>
-      <w:r>
-        <w:t xml:space="preserve"> </w:t>
-      </w:r>
-      <w:r>
-        <w:t xml:space="preserve">SRS, SDD, SPMP, schema (DBML + migrations), CI config, Docker/infra, API contract.</w:t>
-      </w:r>
-    </w:p>
-    <w:p>
-      <w:r>
-        <w:pict>
-          <v:rect style="width:0;height:1.5pt" o:hralign="center" o:hrstd="t" o:hr="t"/>
-        </w:pict>
-      </w:r>
-    </w:p>
-    <w:bookmarkEnd w:id="41"/>
-    <w:bookmarkStart w:id="42" w:name="X10ec23bd76c50fe757b1114add0012ea345cb63"/>
-    <w:p>
-      <w:pPr>
-        <w:pStyle w:val="Heading2"/>
-      </w:pPr>
-      <w:r>
-        <w:t xml:space="preserve">21. Release Management</w:t>
       </w:r>
     </w:p>
     <w:p>
@@ -10518,61 +11056,30 @@
           <w:b/>
           <w:bCs/>
         </w:rPr>
-        <w:t xml:space="preserve">Versioning:</w:t>
-      </w:r>
-      <w:r>
-        <w:t xml:space="preserve"> </w:t>
-      </w:r>
-      <w:r>
-        <w:t xml:space="preserve">Semantic Versioning</w:t>
-      </w:r>
-      <w:r>
-        <w:t xml:space="preserve"> </w:t>
-      </w:r>
-      <w:r>
-        <w:rPr>
-          <w:rStyle w:val="VerbatimChar"/>
-        </w:rPr>
-        <w:t xml:space="preserve">MAJOR.MINOR.PATCH</w:t>
-      </w:r>
-      <w:r>
-        <w:t xml:space="preserve">. Phase GAs are minor/major releases (e.g. P2 GA =</w:t>
-      </w:r>
-      <w:r>
-        <w:t xml:space="preserve"> </w:t>
-      </w:r>
-      <w:r>
-        <w:rPr>
-          <w:rStyle w:val="VerbatimChar"/>
-        </w:rPr>
-        <w:t xml:space="preserve">v1.0.0</w:t>
-      </w:r>
-      <w:r>
-        <w:t xml:space="preserve">, P3 =</w:t>
-      </w:r>
-      <w:r>
-        <w:t xml:space="preserve"> </w:t>
-      </w:r>
-      <w:r>
-        <w:rPr>
-          <w:rStyle w:val="VerbatimChar"/>
-        </w:rPr>
-        <w:t xml:space="preserve">v1.1.0</w:t>
-      </w:r>
-      <w:r>
-        <w:t xml:space="preserve">, P4 =</w:t>
-      </w:r>
-      <w:r>
-        <w:t xml:space="preserve"> </w:t>
-      </w:r>
-      <w:r>
-        <w:rPr>
-          <w:rStyle w:val="VerbatimChar"/>
-        </w:rPr>
-        <w:t xml:space="preserve">v1.2.0</w:t>
-      </w:r>
-      <w:r>
-        <w:t xml:space="preserve">); fixes are patches.</w:t>
+        <w:t xml:space="preserve">Configuration items baselined:</w:t>
+      </w:r>
+      <w:r>
+        <w:t xml:space="preserve"> </w:t>
+      </w:r>
+      <w:r>
+        <w:t xml:space="preserve">SRS, SDD, SPMP, schema (DBML + migrations), CI config, Docker/infra, API contract.</w:t>
+      </w:r>
+    </w:p>
+    <w:p>
+      <w:r>
+        <w:pict>
+          <v:rect style="width:0;height:1.5pt" o:hralign="center" o:hrstd="t" o:hr="t"/>
+        </w:pict>
+      </w:r>
+    </w:p>
+    <w:bookmarkEnd w:id="42"/>
+    <w:bookmarkStart w:id="43" w:name="X10ec23bd76c50fe757b1114add0012ea345cb63"/>
+    <w:p>
+      <w:pPr>
+        <w:pStyle w:val="Heading2"/>
+      </w:pPr>
+      <w:r>
+        <w:t xml:space="preserve">21. Release Management</w:t>
       </w:r>
     </w:p>
     <w:p>
@@ -10580,7 +11087,7 @@
         <w:pStyle w:val="Compact"/>
         <w:numPr>
           <w:ilvl w:val="0"/>
-          <w:numId w:val="1010"/>
+          <w:numId w:val="1011"/>
         </w:numPr>
       </w:pPr>
       <w:r>
@@ -10588,13 +11095,13 @@
           <w:b/>
           <w:bCs/>
         </w:rPr>
-        <w:t xml:space="preserve">Release train:</w:t>
-      </w:r>
-      <w:r>
-        <w:t xml:space="preserve"> </w:t>
-      </w:r>
-      <w:r>
-        <w:t xml:space="preserve">feature-complete → freeze (optional</w:t>
+        <w:t xml:space="preserve">Versioning:</w:t>
+      </w:r>
+      <w:r>
+        <w:t xml:space="preserve"> </w:t>
+      </w:r>
+      <w:r>
+        <w:t xml:space="preserve">Semantic Versioning</w:t>
       </w:r>
       <w:r>
         <w:t xml:space="preserve"> </w:t>
@@ -10603,10 +11110,46 @@
         <w:rPr>
           <w:rStyle w:val="VerbatimChar"/>
         </w:rPr>
-        <w:t xml:space="preserve">release/*</w:t>
-      </w:r>
-      <w:r>
-        <w:t xml:space="preserve">) → hardening (security/a11y/perf/UAT) → tag → deploy to staging → client sign-off → promote to production.</w:t>
+        <w:t xml:space="preserve">MAJOR.MINOR.PATCH</w:t>
+      </w:r>
+      <w:r>
+        <w:t xml:space="preserve">. Phase GAs are minor/major releases (e.g. P2 GA =</w:t>
+      </w:r>
+      <w:r>
+        <w:t xml:space="preserve"> </w:t>
+      </w:r>
+      <w:r>
+        <w:rPr>
+          <w:rStyle w:val="VerbatimChar"/>
+        </w:rPr>
+        <w:t xml:space="preserve">v1.0.0</w:t>
+      </w:r>
+      <w:r>
+        <w:t xml:space="preserve">, P3 =</w:t>
+      </w:r>
+      <w:r>
+        <w:t xml:space="preserve"> </w:t>
+      </w:r>
+      <w:r>
+        <w:rPr>
+          <w:rStyle w:val="VerbatimChar"/>
+        </w:rPr>
+        <w:t xml:space="preserve">v1.1.0</w:t>
+      </w:r>
+      <w:r>
+        <w:t xml:space="preserve">, P4 =</w:t>
+      </w:r>
+      <w:r>
+        <w:t xml:space="preserve"> </w:t>
+      </w:r>
+      <w:r>
+        <w:rPr>
+          <w:rStyle w:val="VerbatimChar"/>
+        </w:rPr>
+        <w:t xml:space="preserve">v1.2.0</w:t>
+      </w:r>
+      <w:r>
+        <w:t xml:space="preserve">); fixes are patches.</w:t>
       </w:r>
     </w:p>
     <w:p>
@@ -10614,7 +11157,7 @@
         <w:pStyle w:val="Compact"/>
         <w:numPr>
           <w:ilvl w:val="0"/>
-          <w:numId w:val="1010"/>
+          <w:numId w:val="1011"/>
         </w:numPr>
       </w:pPr>
       <w:r>
@@ -10622,13 +11165,25 @@
           <w:b/>
           <w:bCs/>
         </w:rPr>
-        <w:t xml:space="preserve">Changelog:</w:t>
-      </w:r>
-      <w:r>
-        <w:t xml:space="preserve"> </w:t>
-      </w:r>
-      <w:r>
-        <w:t xml:space="preserve">generated from Conventional Commits per release.</w:t>
+        <w:t xml:space="preserve">Release train:</w:t>
+      </w:r>
+      <w:r>
+        <w:t xml:space="preserve"> </w:t>
+      </w:r>
+      <w:r>
+        <w:t xml:space="preserve">feature-complete → freeze (optional</w:t>
+      </w:r>
+      <w:r>
+        <w:t xml:space="preserve"> </w:t>
+      </w:r>
+      <w:r>
+        <w:rPr>
+          <w:rStyle w:val="VerbatimChar"/>
+        </w:rPr>
+        <w:t xml:space="preserve">release/*</w:t>
+      </w:r>
+      <w:r>
+        <w:t xml:space="preserve">) → hardening (security/a11y/perf/UAT) → tag → deploy to staging → client sign-off → promote to production.</w:t>
       </w:r>
     </w:p>
     <w:p>
@@ -10636,7 +11191,29 @@
         <w:pStyle w:val="Compact"/>
         <w:numPr>
           <w:ilvl w:val="0"/>
-          <w:numId w:val="1010"/>
+          <w:numId w:val="1011"/>
+        </w:numPr>
+      </w:pPr>
+      <w:r>
+        <w:rPr>
+          <w:b/>
+          <w:bCs/>
+        </w:rPr>
+        <w:t xml:space="preserve">Changelog:</w:t>
+      </w:r>
+      <w:r>
+        <w:t xml:space="preserve"> </w:t>
+      </w:r>
+      <w:r>
+        <w:t xml:space="preserve">generated from Conventional Commits per release.</w:t>
+      </w:r>
+    </w:p>
+    <w:p>
+      <w:pPr>
+        <w:pStyle w:val="Compact"/>
+        <w:numPr>
+          <w:ilvl w:val="0"/>
+          <w:numId w:val="1011"/>
         </w:numPr>
       </w:pPr>
       <w:r>
@@ -10704,7 +11281,7 @@
         <w:pStyle w:val="Compact"/>
         <w:numPr>
           <w:ilvl w:val="0"/>
-          <w:numId w:val="1010"/>
+          <w:numId w:val="1011"/>
         </w:numPr>
       </w:pPr>
       <w:r>
@@ -10774,7 +11351,7 @@
         <w:pStyle w:val="Compact"/>
         <w:numPr>
           <w:ilvl w:val="0"/>
-          <w:numId w:val="1010"/>
+          <w:numId w:val="1011"/>
         </w:numPr>
       </w:pPr>
       <w:r>
@@ -10809,8 +11386,8 @@
         </w:pict>
       </w:r>
     </w:p>
-    <w:bookmarkEnd w:id="42"/>
-    <w:bookmarkStart w:id="43" w:name="X5f797ea3a8639423e17d0d384bccacdf35b49ad"/>
+    <w:bookmarkEnd w:id="43"/>
+    <w:bookmarkStart w:id="44" w:name="X5f797ea3a8639423e17d0d384bccacdf35b49ad"/>
     <w:p>
       <w:pPr>
         <w:pStyle w:val="Heading2"/>
@@ -11659,8 +12236,8 @@
         </w:pict>
       </w:r>
     </w:p>
-    <w:bookmarkEnd w:id="43"/>
-    <w:bookmarkStart w:id="44" w:name="X7c127fed55bc99364e804d184ecf3110f2fe24c"/>
+    <w:bookmarkEnd w:id="44"/>
+    <w:bookmarkStart w:id="45" w:name="X7c127fed55bc99364e804d184ecf3110f2fe24c"/>
     <w:p>
       <w:pPr>
         <w:pStyle w:val="Heading2"/>
@@ -11674,7 +12251,7 @@
         <w:pStyle w:val="Compact"/>
         <w:numPr>
           <w:ilvl w:val="0"/>
-          <w:numId w:val="1011"/>
+          <w:numId w:val="1012"/>
         </w:numPr>
       </w:pPr>
       <w:r>
@@ -11707,7 +12284,7 @@
         <w:pStyle w:val="Compact"/>
         <w:numPr>
           <w:ilvl w:val="0"/>
-          <w:numId w:val="1011"/>
+          <w:numId w:val="1012"/>
         </w:numPr>
       </w:pPr>
       <w:r>
@@ -11843,7 +12420,7 @@
         <w:pStyle w:val="Compact"/>
         <w:numPr>
           <w:ilvl w:val="0"/>
-          <w:numId w:val="1011"/>
+          <w:numId w:val="1012"/>
         </w:numPr>
       </w:pPr>
       <w:r>
@@ -11865,7 +12442,7 @@
         <w:pStyle w:val="Compact"/>
         <w:numPr>
           <w:ilvl w:val="0"/>
-          <w:numId w:val="1011"/>
+          <w:numId w:val="1012"/>
         </w:numPr>
       </w:pPr>
       <w:r>
@@ -11887,7 +12464,7 @@
         <w:pStyle w:val="Compact"/>
         <w:numPr>
           <w:ilvl w:val="0"/>
-          <w:numId w:val="1011"/>
+          <w:numId w:val="1012"/>
         </w:numPr>
       </w:pPr>
       <w:r>
@@ -11909,7 +12486,7 @@
         <w:pStyle w:val="Compact"/>
         <w:numPr>
           <w:ilvl w:val="0"/>
-          <w:numId w:val="1011"/>
+          <w:numId w:val="1012"/>
         </w:numPr>
       </w:pPr>
       <w:r>
@@ -11933,8 +12510,8 @@
         </w:pict>
       </w:r>
     </w:p>
-    <w:bookmarkEnd w:id="44"/>
-    <w:bookmarkStart w:id="45" w:name="X17b137da2ab7cd7a2679e0634a46c594e956106"/>
+    <w:bookmarkEnd w:id="45"/>
+    <w:bookmarkStart w:id="46" w:name="X17b137da2ab7cd7a2679e0634a46c594e956106"/>
     <w:p>
       <w:pPr>
         <w:pStyle w:val="Heading2"/>
@@ -12394,8 +12971,8 @@
         </w:pict>
       </w:r>
     </w:p>
-    <w:bookmarkEnd w:id="45"/>
-    <w:bookmarkStart w:id="46" w:name="Xc1667bad2838613ad799ea9f5cdba61081d7f61"/>
+    <w:bookmarkEnd w:id="46"/>
+    <w:bookmarkStart w:id="47" w:name="Xc1667bad2838613ad799ea9f5cdba61081d7f61"/>
     <w:p>
       <w:pPr>
         <w:pStyle w:val="Heading2"/>
@@ -12409,7 +12986,7 @@
         <w:pStyle w:val="Compact"/>
         <w:numPr>
           <w:ilvl w:val="0"/>
-          <w:numId w:val="1012"/>
+          <w:numId w:val="1013"/>
         </w:numPr>
       </w:pPr>
       <w:r>
@@ -12431,7 +13008,7 @@
         <w:pStyle w:val="Compact"/>
         <w:numPr>
           <w:ilvl w:val="0"/>
-          <w:numId w:val="1012"/>
+          <w:numId w:val="1013"/>
         </w:numPr>
       </w:pPr>
       <w:r>
@@ -12484,7 +13061,7 @@
         <w:pStyle w:val="Compact"/>
         <w:numPr>
           <w:ilvl w:val="0"/>
-          <w:numId w:val="1012"/>
+          <w:numId w:val="1013"/>
         </w:numPr>
       </w:pPr>
       <w:r>
@@ -12564,7 +13141,7 @@
         <w:pStyle w:val="Compact"/>
         <w:numPr>
           <w:ilvl w:val="0"/>
-          <w:numId w:val="1012"/>
+          <w:numId w:val="1013"/>
         </w:numPr>
       </w:pPr>
       <w:r>
@@ -12635,7 +13212,7 @@
         <w:pStyle w:val="Compact"/>
         <w:numPr>
           <w:ilvl w:val="0"/>
-          <w:numId w:val="1012"/>
+          <w:numId w:val="1013"/>
         </w:numPr>
       </w:pPr>
       <w:r>
@@ -12666,7 +13243,7 @@
         <w:pStyle w:val="Compact"/>
         <w:numPr>
           <w:ilvl w:val="0"/>
-          <w:numId w:val="1012"/>
+          <w:numId w:val="1013"/>
         </w:numPr>
       </w:pPr>
       <w:r>
@@ -12690,8 +13267,8 @@
         </w:pict>
       </w:r>
     </w:p>
-    <w:bookmarkEnd w:id="46"/>
-    <w:bookmarkStart w:id="47" w:name="Xe0c21efbbf54bff1aef621db44d3f72082755a8"/>
+    <w:bookmarkEnd w:id="47"/>
+    <w:bookmarkStart w:id="48" w:name="Xe0c21efbbf54bff1aef621db44d3f72082755a8"/>
     <w:p>
       <w:pPr>
         <w:pStyle w:val="Heading2"/>
@@ -12744,7 +13321,7 @@
         <w:pStyle w:val="Compact"/>
         <w:numPr>
           <w:ilvl w:val="0"/>
-          <w:numId w:val="1013"/>
+          <w:numId w:val="1014"/>
         </w:numPr>
       </w:pPr>
       <w:r>
@@ -12805,7 +13382,7 @@
         <w:pStyle w:val="Compact"/>
         <w:numPr>
           <w:ilvl w:val="0"/>
-          <w:numId w:val="1013"/>
+          <w:numId w:val="1014"/>
         </w:numPr>
       </w:pPr>
       <w:r>
@@ -12882,7 +13459,7 @@
         <w:pStyle w:val="Compact"/>
         <w:numPr>
           <w:ilvl w:val="0"/>
-          <w:numId w:val="1013"/>
+          <w:numId w:val="1014"/>
         </w:numPr>
       </w:pPr>
       <w:r>
@@ -12941,7 +13518,7 @@
         <w:pStyle w:val="Compact"/>
         <w:numPr>
           <w:ilvl w:val="0"/>
-          <w:numId w:val="1013"/>
+          <w:numId w:val="1014"/>
         </w:numPr>
       </w:pPr>
       <w:r>
@@ -12963,7 +13540,7 @@
         <w:pStyle w:val="Compact"/>
         <w:numPr>
           <w:ilvl w:val="0"/>
-          <w:numId w:val="1013"/>
+          <w:numId w:val="1014"/>
         </w:numPr>
       </w:pPr>
       <w:r>
@@ -13009,7 +13586,7 @@
         <w:pStyle w:val="Compact"/>
         <w:numPr>
           <w:ilvl w:val="0"/>
-          <w:numId w:val="1013"/>
+          <w:numId w:val="1014"/>
         </w:numPr>
       </w:pPr>
       <w:r>
@@ -13042,7 +13619,7 @@
         <w:pStyle w:val="Compact"/>
         <w:numPr>
           <w:ilvl w:val="0"/>
-          <w:numId w:val="1013"/>
+          <w:numId w:val="1014"/>
         </w:numPr>
       </w:pPr>
       <w:r>
@@ -13066,8 +13643,8 @@
         </w:pict>
       </w:r>
     </w:p>
-    <w:bookmarkEnd w:id="47"/>
-    <w:bookmarkStart w:id="48" w:name="Xcaa1106376335f5b670877030f0b42385e0b021"/>
+    <w:bookmarkEnd w:id="48"/>
+    <w:bookmarkStart w:id="49" w:name="Xcaa1106376335f5b670877030f0b42385e0b021"/>
     <w:p>
       <w:pPr>
         <w:pStyle w:val="Heading2"/>
@@ -13115,7 +13692,7 @@
         <w:pStyle w:val="Compact"/>
         <w:numPr>
           <w:ilvl w:val="0"/>
-          <w:numId w:val="1014"/>
+          <w:numId w:val="1015"/>
         </w:numPr>
       </w:pPr>
       <w:r>
@@ -13174,7 +13751,7 @@
         <w:pStyle w:val="Compact"/>
         <w:numPr>
           <w:ilvl w:val="0"/>
-          <w:numId w:val="1014"/>
+          <w:numId w:val="1015"/>
         </w:numPr>
       </w:pPr>
       <w:r>
@@ -13219,7 +13796,7 @@
         <w:pStyle w:val="Compact"/>
         <w:numPr>
           <w:ilvl w:val="0"/>
-          <w:numId w:val="1014"/>
+          <w:numId w:val="1015"/>
         </w:numPr>
       </w:pPr>
       <w:r>
@@ -13297,7 +13874,7 @@
         <w:pStyle w:val="Compact"/>
         <w:numPr>
           <w:ilvl w:val="0"/>
-          <w:numId w:val="1014"/>
+          <w:numId w:val="1015"/>
         </w:numPr>
       </w:pPr>
       <w:r>
@@ -13336,7 +13913,7 @@
         <w:pStyle w:val="Compact"/>
         <w:numPr>
           <w:ilvl w:val="0"/>
-          <w:numId w:val="1014"/>
+          <w:numId w:val="1015"/>
         </w:numPr>
       </w:pPr>
       <w:r>
@@ -13373,7 +13950,7 @@
         <w:pStyle w:val="Compact"/>
         <w:numPr>
           <w:ilvl w:val="0"/>
-          <w:numId w:val="1014"/>
+          <w:numId w:val="1015"/>
         </w:numPr>
       </w:pPr>
       <w:r>
@@ -13411,8 +13988,8 @@
         </w:pict>
       </w:r>
     </w:p>
-    <w:bookmarkEnd w:id="48"/>
-    <w:bookmarkStart w:id="49" w:name="Xc24e2f63330fbcd95a9d9d459af6d05d097a40f"/>
+    <w:bookmarkEnd w:id="49"/>
+    <w:bookmarkStart w:id="50" w:name="Xc24e2f63330fbcd95a9d9d459af6d05d097a40f"/>
     <w:p>
       <w:pPr>
         <w:pStyle w:val="Heading2"/>
@@ -13477,7 +14054,7 @@
         <w:pStyle w:val="Compact"/>
         <w:numPr>
           <w:ilvl w:val="0"/>
-          <w:numId w:val="1015"/>
+          <w:numId w:val="1016"/>
         </w:numPr>
       </w:pPr>
       <w:r>
@@ -13540,7 +14117,7 @@
         <w:pStyle w:val="Compact"/>
         <w:numPr>
           <w:ilvl w:val="0"/>
-          <w:numId w:val="1015"/>
+          <w:numId w:val="1016"/>
         </w:numPr>
       </w:pPr>
       <w:r>
@@ -13573,7 +14150,7 @@
         <w:pStyle w:val="Compact"/>
         <w:numPr>
           <w:ilvl w:val="0"/>
-          <w:numId w:val="1015"/>
+          <w:numId w:val="1016"/>
         </w:numPr>
       </w:pPr>
       <w:r>
@@ -13639,7 +14216,7 @@
         <w:pStyle w:val="Compact"/>
         <w:numPr>
           <w:ilvl w:val="0"/>
-          <w:numId w:val="1015"/>
+          <w:numId w:val="1016"/>
         </w:numPr>
       </w:pPr>
       <w:r>
@@ -13661,7 +14238,7 @@
         <w:pStyle w:val="Compact"/>
         <w:numPr>
           <w:ilvl w:val="0"/>
-          <w:numId w:val="1015"/>
+          <w:numId w:val="1016"/>
         </w:numPr>
       </w:pPr>
       <w:r>
@@ -13725,7 +14302,7 @@
         <w:pStyle w:val="Compact"/>
         <w:numPr>
           <w:ilvl w:val="0"/>
-          <w:numId w:val="1015"/>
+          <w:numId w:val="1016"/>
         </w:numPr>
       </w:pPr>
       <w:r>
@@ -13760,8 +14337,8 @@
         </w:pict>
       </w:r>
     </w:p>
-    <w:bookmarkEnd w:id="49"/>
-    <w:bookmarkStart w:id="50" w:name="X62d5d21cd56884c64b466b96134167705d5da4b"/>
+    <w:bookmarkEnd w:id="50"/>
+    <w:bookmarkStart w:id="51" w:name="X62d5d21cd56884c64b466b96134167705d5da4b"/>
     <w:p>
       <w:pPr>
         <w:pStyle w:val="Heading2"/>
@@ -13814,7 +14391,7 @@
         <w:pStyle w:val="Compact"/>
         <w:numPr>
           <w:ilvl w:val="0"/>
-          <w:numId w:val="1016"/>
+          <w:numId w:val="1017"/>
         </w:numPr>
       </w:pPr>
       <w:r>
@@ -13852,7 +14429,7 @@
         <w:pStyle w:val="Compact"/>
         <w:numPr>
           <w:ilvl w:val="0"/>
-          <w:numId w:val="1016"/>
+          <w:numId w:val="1017"/>
         </w:numPr>
       </w:pPr>
       <w:r>
@@ -13883,7 +14460,7 @@
         <w:pStyle w:val="Compact"/>
         <w:numPr>
           <w:ilvl w:val="0"/>
-          <w:numId w:val="1016"/>
+          <w:numId w:val="1017"/>
         </w:numPr>
       </w:pPr>
       <w:r>
@@ -13920,7 +14497,7 @@
         <w:pStyle w:val="Compact"/>
         <w:numPr>
           <w:ilvl w:val="0"/>
-          <w:numId w:val="1016"/>
+          <w:numId w:val="1017"/>
         </w:numPr>
       </w:pPr>
       <w:r>
@@ -13965,7 +14542,7 @@
         <w:pStyle w:val="Compact"/>
         <w:numPr>
           <w:ilvl w:val="0"/>
-          <w:numId w:val="1016"/>
+          <w:numId w:val="1017"/>
         </w:numPr>
       </w:pPr>
       <w:r>
@@ -14012,7 +14589,7 @@
         <w:pStyle w:val="Compact"/>
         <w:numPr>
           <w:ilvl w:val="0"/>
-          <w:numId w:val="1016"/>
+          <w:numId w:val="1017"/>
         </w:numPr>
       </w:pPr>
       <w:r>
@@ -14045,7 +14622,7 @@
         <w:pStyle w:val="Compact"/>
         <w:numPr>
           <w:ilvl w:val="0"/>
-          <w:numId w:val="1016"/>
+          <w:numId w:val="1017"/>
         </w:numPr>
       </w:pPr>
       <w:r>
@@ -14081,7 +14658,7 @@
         <w:pStyle w:val="Compact"/>
         <w:numPr>
           <w:ilvl w:val="0"/>
-          <w:numId w:val="1016"/>
+          <w:numId w:val="1017"/>
         </w:numPr>
       </w:pPr>
       <w:r>
@@ -14120,8 +14697,8 @@
         </w:pict>
       </w:r>
     </w:p>
-    <w:bookmarkEnd w:id="50"/>
-    <w:bookmarkStart w:id="51" w:name="X50ba4783dd86237f8c9ac8b21f022691915a64f"/>
+    <w:bookmarkEnd w:id="51"/>
+    <w:bookmarkStart w:id="52" w:name="X50ba4783dd86237f8c9ac8b21f022691915a64f"/>
     <w:p>
       <w:pPr>
         <w:pStyle w:val="Heading2"/>
@@ -14135,7 +14712,7 @@
         <w:pStyle w:val="Compact"/>
         <w:numPr>
           <w:ilvl w:val="0"/>
-          <w:numId w:val="1017"/>
+          <w:numId w:val="1018"/>
         </w:numPr>
       </w:pPr>
       <w:r>
@@ -14228,7 +14805,7 @@
         <w:pStyle w:val="Compact"/>
         <w:numPr>
           <w:ilvl w:val="0"/>
-          <w:numId w:val="1017"/>
+          <w:numId w:val="1018"/>
         </w:numPr>
       </w:pPr>
       <w:r>
@@ -14250,7 +14827,7 @@
         <w:pStyle w:val="Compact"/>
         <w:numPr>
           <w:ilvl w:val="0"/>
-          <w:numId w:val="1017"/>
+          <w:numId w:val="1018"/>
         </w:numPr>
       </w:pPr>
       <w:r>
@@ -14283,7 +14860,7 @@
         <w:pStyle w:val="Compact"/>
         <w:numPr>
           <w:ilvl w:val="0"/>
-          <w:numId w:val="1017"/>
+          <w:numId w:val="1018"/>
         </w:numPr>
       </w:pPr>
       <w:r>
@@ -14305,7 +14882,7 @@
         <w:pStyle w:val="Compact"/>
         <w:numPr>
           <w:ilvl w:val="0"/>
-          <w:numId w:val="1017"/>
+          <w:numId w:val="1018"/>
         </w:numPr>
       </w:pPr>
       <w:r>
@@ -14360,7 +14937,7 @@
         <w:pStyle w:val="Compact"/>
         <w:numPr>
           <w:ilvl w:val="0"/>
-          <w:numId w:val="1017"/>
+          <w:numId w:val="1018"/>
         </w:numPr>
       </w:pPr>
       <w:r>
@@ -14408,8 +14985,8 @@
         </w:pict>
       </w:r>
     </w:p>
-    <w:bookmarkEnd w:id="51"/>
-    <w:bookmarkStart w:id="52" w:name="Xf9f497fae0149d24face411099e20cd65ecbf75"/>
+    <w:bookmarkEnd w:id="52"/>
+    <w:bookmarkStart w:id="53" w:name="Xf9f497fae0149d24face411099e20cd65ecbf75"/>
     <w:p>
       <w:pPr>
         <w:pStyle w:val="Heading2"/>
@@ -14459,7 +15036,7 @@
         <w:pStyle w:val="Compact"/>
         <w:numPr>
           <w:ilvl w:val="0"/>
-          <w:numId w:val="1018"/>
+          <w:numId w:val="1019"/>
         </w:numPr>
       </w:pPr>
       <w:r>
@@ -14510,7 +15087,7 @@
         <w:pStyle w:val="Compact"/>
         <w:numPr>
           <w:ilvl w:val="0"/>
-          <w:numId w:val="1018"/>
+          <w:numId w:val="1019"/>
         </w:numPr>
       </w:pPr>
       <w:r>
@@ -14591,7 +15168,7 @@
         <w:pStyle w:val="Compact"/>
         <w:numPr>
           <w:ilvl w:val="0"/>
-          <w:numId w:val="1018"/>
+          <w:numId w:val="1019"/>
         </w:numPr>
       </w:pPr>
       <w:r>
@@ -14640,7 +15217,7 @@
         <w:pStyle w:val="Compact"/>
         <w:numPr>
           <w:ilvl w:val="0"/>
-          <w:numId w:val="1018"/>
+          <w:numId w:val="1019"/>
         </w:numPr>
       </w:pPr>
       <w:r>
@@ -14662,7 +15239,7 @@
         <w:pStyle w:val="Compact"/>
         <w:numPr>
           <w:ilvl w:val="0"/>
-          <w:numId w:val="1018"/>
+          <w:numId w:val="1019"/>
         </w:numPr>
       </w:pPr>
       <w:r>
@@ -14686,8 +15263,8 @@
         </w:pict>
       </w:r>
     </w:p>
-    <w:bookmarkEnd w:id="52"/>
-    <w:bookmarkStart w:id="53" w:name="X500c8d27e36a033cdfb0bc3a88e2cac8ee65ae8"/>
+    <w:bookmarkEnd w:id="53"/>
+    <w:bookmarkStart w:id="54" w:name="X500c8d27e36a033cdfb0bc3a88e2cac8ee65ae8"/>
     <w:p>
       <w:pPr>
         <w:pStyle w:val="Heading2"/>
@@ -15126,8 +15703,8 @@
         </w:pict>
       </w:r>
     </w:p>
-    <w:bookmarkEnd w:id="53"/>
-    <w:bookmarkStart w:id="54" w:name="appendix-a--tooling--command-reference"/>
+    <w:bookmarkEnd w:id="54"/>
+    <w:bookmarkStart w:id="55" w:name="appendix-a--tooling--command-reference"/>
     <w:p>
       <w:pPr>
         <w:pStyle w:val="Heading2"/>
@@ -15711,8 +16288,8 @@
         </w:pict>
       </w:r>
     </w:p>
-    <w:bookmarkEnd w:id="54"/>
-    <w:bookmarkStart w:id="55" w:name="appendix-b--assumption-register"/>
+    <w:bookmarkEnd w:id="55"/>
+    <w:bookmarkStart w:id="56" w:name="appendix-b--assumption-register"/>
     <w:p>
       <w:pPr>
         <w:pStyle w:val="Heading2"/>
@@ -16309,8 +16886,8 @@
         </w:pict>
       </w:r>
     </w:p>
-    <w:bookmarkEnd w:id="55"/>
-    <w:bookmarkStart w:id="62" w:name="appendix-c--consistency-review-log"/>
+    <w:bookmarkEnd w:id="56"/>
+    <w:bookmarkStart w:id="63" w:name="appendix-c--consistency-review-log"/>
     <w:p>
       <w:pPr>
         <w:pStyle w:val="Heading2"/>
@@ -16327,7 +16904,7 @@
         <w:t xml:space="preserve">Per the required post-generation review: verify consistency with the approved SRS and SDD, remove contradictions/duplication, and improve clarity.</w:t>
       </w:r>
     </w:p>
-    <w:bookmarkStart w:id="56" w:name="c1-sources-reconciled"/>
+    <w:bookmarkStart w:id="57" w:name="c1-sources-reconciled"/>
     <w:p>
       <w:pPr>
         <w:pStyle w:val="Heading3"/>
@@ -16486,294 +17063,14 @@
         <w:t xml:space="preserve">— read directly for realism.</w:t>
       </w:r>
     </w:p>
-    <w:bookmarkEnd w:id="56"/>
-    <w:bookmarkStart w:id="57" w:name="c2-srssdd-consistency--confirmed"/>
+    <w:bookmarkEnd w:id="57"/>
+    <w:bookmarkStart w:id="58" w:name="c2-srssdd-consistency--confirmed"/>
     <w:p>
       <w:pPr>
         <w:pStyle w:val="Heading3"/>
       </w:pPr>
       <w:r>
         <w:t xml:space="preserve">C.2 SRS/SDD consistency — confirmed</w:t>
-      </w:r>
-    </w:p>
-    <w:p>
-      <w:pPr>
-        <w:pStyle w:val="Compact"/>
-        <w:numPr>
-          <w:ilvl w:val="0"/>
-          <w:numId w:val="1019"/>
-        </w:numPr>
-      </w:pPr>
-      <w:r>
-        <w:rPr>
-          <w:b/>
-          <w:bCs/>
-        </w:rPr>
-        <w:t xml:space="preserve">Phasing</w:t>
-      </w:r>
-      <w:r>
-        <w:t xml:space="preserve"> </w:t>
-      </w:r>
-      <w:r>
-        <w:t xml:space="preserve">(P2/P3/P4/Future) is identical across SRS, SDD, and this plan; the WBS, phase plan, milestones, and roadmap all use it.</w:t>
-      </w:r>
-    </w:p>
-    <w:p>
-      <w:pPr>
-        <w:pStyle w:val="Compact"/>
-        <w:numPr>
-          <w:ilvl w:val="0"/>
-          <w:numId w:val="1019"/>
-        </w:numPr>
-      </w:pPr>
-      <w:r>
-        <w:rPr>
-          <w:b/>
-          <w:bCs/>
-        </w:rPr>
-        <w:t xml:space="preserve">Acceptance</w:t>
-      </w:r>
-      <w:r>
-        <w:t xml:space="preserve"> </w:t>
-      </w:r>
-      <w:r>
-        <w:t xml:space="preserve">references SRS §31 (global gates + feature ACs) rather than inventing new criteria.</w:t>
-      </w:r>
-    </w:p>
-    <w:p>
-      <w:pPr>
-        <w:pStyle w:val="Compact"/>
-        <w:numPr>
-          <w:ilvl w:val="0"/>
-          <w:numId w:val="1019"/>
-        </w:numPr>
-      </w:pPr>
-      <w:r>
-        <w:rPr>
-          <w:b/>
-          <w:bCs/>
-        </w:rPr>
-        <w:t xml:space="preserve">Domains</w:t>
-      </w:r>
-      <w:r>
-        <w:t xml:space="preserve"> </w:t>
-      </w:r>
-      <w:r>
-        <w:t xml:space="preserve">in the WBS match SDD §14, including the two new P2 domains from</w:t>
-      </w:r>
-      <w:r>
-        <w:t xml:space="preserve"> </w:t>
-      </w:r>
-      <w:r>
-        <w:rPr>
-          <w:b/>
-          <w:bCs/>
-        </w:rPr>
-        <w:t xml:space="preserve">RES-01 (Locations)</w:t>
-      </w:r>
-      <w:r>
-        <w:t xml:space="preserve"> </w:t>
-      </w:r>
-      <w:r>
-        <w:t xml:space="preserve">and</w:t>
-      </w:r>
-      <w:r>
-        <w:t xml:space="preserve"> </w:t>
-      </w:r>
-      <w:r>
-        <w:rPr>
-          <w:b/>
-          <w:bCs/>
-        </w:rPr>
-        <w:t xml:space="preserve">RES-02 (Identity, Administration)</w:t>
-      </w:r>
-      <w:r>
-        <w:t xml:space="preserve"> </w:t>
-      </w:r>
-      <w:r>
-        <w:t xml:space="preserve">— the plan schedules exactly those.</w:t>
-      </w:r>
-    </w:p>
-    <w:p>
-      <w:pPr>
-        <w:pStyle w:val="Compact"/>
-        <w:numPr>
-          <w:ilvl w:val="0"/>
-          <w:numId w:val="1019"/>
-        </w:numPr>
-      </w:pPr>
-      <w:r>
-        <w:rPr>
-          <w:b/>
-          <w:bCs/>
-        </w:rPr>
-        <w:t xml:space="preserve">Risks:</w:t>
-      </w:r>
-      <w:r>
-        <w:t xml:space="preserve"> </w:t>
-      </w:r>
-      <w:r>
-        <w:t xml:space="preserve">product/technical risks are inherited from SRS §32 (</w:t>
-      </w:r>
-      <w:r>
-        <w:rPr>
-          <w:rStyle w:val="VerbatimChar"/>
-        </w:rPr>
-        <w:t xml:space="preserve">RSK-*</w:t>
-      </w:r>
-      <w:r>
-        <w:t xml:space="preserve">) and</w:t>
-      </w:r>
-      <w:r>
-        <w:t xml:space="preserve"> </w:t>
-      </w:r>
-      <w:r>
-        <w:rPr>
-          <w:i/>
-          <w:iCs/>
-        </w:rPr>
-        <w:t xml:space="preserve">not duplicated</w:t>
-      </w:r>
-      <w:r>
-        <w:t xml:space="preserve">; only project/management risks (</w:t>
-      </w:r>
-      <w:r>
-        <w:rPr>
-          <w:rStyle w:val="VerbatimChar"/>
-        </w:rPr>
-        <w:t xml:space="preserve">PR-*</w:t>
-      </w:r>
-      <w:r>
-        <w:t xml:space="preserve">) are added here.</w:t>
-      </w:r>
-    </w:p>
-    <w:p>
-      <w:pPr>
-        <w:pStyle w:val="Compact"/>
-        <w:numPr>
-          <w:ilvl w:val="0"/>
-          <w:numId w:val="1019"/>
-        </w:numPr>
-      </w:pPr>
-      <w:r>
-        <w:rPr>
-          <w:b/>
-          <w:bCs/>
-        </w:rPr>
-        <w:t xml:space="preserve">Open decisions</w:t>
-      </w:r>
-      <w:r>
-        <w:t xml:space="preserve"> </w:t>
-      </w:r>
-      <w:r>
-        <w:t xml:space="preserve">(</w:t>
-      </w:r>
-      <w:r>
-        <w:rPr>
-          <w:rStyle w:val="VerbatimChar"/>
-        </w:rPr>
-        <w:t xml:space="preserve">OI-01..07</w:t>
-      </w:r>
-      <w:r>
-        <w:t xml:space="preserve">) are carried as change items in §25/§32, consistent with the SRS.</w:t>
-      </w:r>
-    </w:p>
-    <w:p>
-      <w:pPr>
-        <w:pStyle w:val="Compact"/>
-        <w:numPr>
-          <w:ilvl w:val="0"/>
-          <w:numId w:val="1019"/>
-        </w:numPr>
-      </w:pPr>
-      <w:r>
-        <w:rPr>
-          <w:b/>
-          <w:bCs/>
-        </w:rPr>
-        <w:t xml:space="preserve">Security/backup/deployment</w:t>
-      </w:r>
-      <w:r>
-        <w:t xml:space="preserve"> </w:t>
-      </w:r>
-      <w:r>
-        <w:t xml:space="preserve">reference SDD §29/§5/§37 and SRS NFR targets (RPO ≤ 24 h, RTO ≤ 4 h, uptime ≥ 99.5%) without restating them.</w:t>
-      </w:r>
-    </w:p>
-    <w:bookmarkEnd w:id="57"/>
-    <w:bookmarkStart w:id="58" w:name="c3-repository-consistency--confirmed"/>
-    <w:p>
-      <w:pPr>
-        <w:pStyle w:val="Heading3"/>
-      </w:pPr>
-      <w:r>
-        <w:t xml:space="preserve">C.3 Repository consistency — confirmed</w:t>
-      </w:r>
-    </w:p>
-    <w:p>
-      <w:pPr>
-        <w:pStyle w:val="FirstParagraph"/>
-      </w:pPr>
-      <w:r>
-        <w:t xml:space="preserve">CI gates,</w:t>
-      </w:r>
-      <w:r>
-        <w:t xml:space="preserve"> </w:t>
-      </w:r>
-      <w:r>
-        <w:rPr>
-          <w:rStyle w:val="VerbatimChar"/>
-        </w:rPr>
-        <w:t xml:space="preserve">make</w:t>
-      </w:r>
-      <w:r>
-        <w:t xml:space="preserve">/</w:t>
-      </w:r>
-      <w:r>
-        <w:rPr>
-          <w:rStyle w:val="VerbatimChar"/>
-        </w:rPr>
-        <w:t xml:space="preserve">scripts</w:t>
-      </w:r>
-      <w:r>
-        <w:t xml:space="preserve"> </w:t>
-      </w:r>
-      <w:r>
-        <w:t xml:space="preserve">commands, env-file strategy, Redis-for-everything scale-readiness, Sanctum stateful-domain config, and the</w:t>
-      </w:r>
-      <w:r>
-        <w:t xml:space="preserve"> </w:t>
-      </w:r>
-      <w:r>
-        <w:rPr>
-          <w:rStyle w:val="VerbatimChar"/>
-        </w:rPr>
-        <w:t xml:space="preserve">backup.sh</w:t>
-      </w:r>
-      <w:r>
-        <w:t xml:space="preserve">/</w:t>
-      </w:r>
-      <w:r>
-        <w:rPr>
-          <w:rStyle w:val="VerbatimChar"/>
-        </w:rPr>
-        <w:t xml:space="preserve">restore.sh</w:t>
-      </w:r>
-      <w:r>
-        <w:t xml:space="preserve"> </w:t>
-      </w:r>
-      <w:r>
-        <w:t xml:space="preserve">flow described here match the implemented files exactly (Appendix A). The “current state” table (§2.2) matches the git history (phases 0–7 + DB layer) and the SDD’s statement that the application layer is not yet built.</w:t>
-      </w:r>
-    </w:p>
-    <w:bookmarkEnd w:id="58"/>
-    <w:bookmarkStart w:id="59" w:name="c4-contradictions--duplication-removed"/>
-    <w:p>
-      <w:pPr>
-        <w:pStyle w:val="Heading3"/>
-      </w:pPr>
-      <w:r>
-        <w:t xml:space="preserve">C.4 Contradictions &amp; duplication removed</w:t>
       </w:r>
     </w:p>
     <w:p>
@@ -16789,13 +17086,13 @@
           <w:b/>
           <w:bCs/>
         </w:rPr>
-        <w:t xml:space="preserve">No duplication of requirements/design/schema:</w:t>
-      </w:r>
-      <w:r>
-        <w:t xml:space="preserve"> </w:t>
-      </w:r>
-      <w:r>
-        <w:t xml:space="preserve">all referenced by ID; product scope defers to SRS §3; deployment/security defer to SDD.</w:t>
+        <w:t xml:space="preserve">Phasing</w:t>
+      </w:r>
+      <w:r>
+        <w:t xml:space="preserve"> </w:t>
+      </w:r>
+      <w:r>
+        <w:t xml:space="preserve">(P2/P3/P4/Future) is identical across SRS, SDD, and this plan; the WBS, phase plan, milestones, and roadmap all use it.</w:t>
       </w:r>
     </w:p>
     <w:p>
@@ -16811,40 +17108,13 @@
           <w:b/>
           <w:bCs/>
         </w:rPr>
-        <w:t xml:space="preserve">Risk duplication avoided:</w:t>
-      </w:r>
-      <w:r>
-        <w:t xml:space="preserve"> </w:t>
-      </w:r>
-      <w:r>
-        <w:t xml:space="preserve">SRS</w:t>
-      </w:r>
-      <w:r>
-        <w:t xml:space="preserve"> </w:t>
-      </w:r>
-      <w:r>
-        <w:rPr>
-          <w:rStyle w:val="VerbatimChar"/>
-        </w:rPr>
-        <w:t xml:space="preserve">RSK-*</w:t>
-      </w:r>
-      <w:r>
-        <w:t xml:space="preserve"> </w:t>
-      </w:r>
-      <w:r>
-        <w:t xml:space="preserve">referenced, not copied; management risks separated as</w:t>
-      </w:r>
-      <w:r>
-        <w:t xml:space="preserve"> </w:t>
-      </w:r>
-      <w:r>
-        <w:rPr>
-          <w:rStyle w:val="VerbatimChar"/>
-        </w:rPr>
-        <w:t xml:space="preserve">PR-*</w:t>
-      </w:r>
-      <w:r>
-        <w:t xml:space="preserve">.</w:t>
+        <w:t xml:space="preserve">Acceptance</w:t>
+      </w:r>
+      <w:r>
+        <w:t xml:space="preserve"> </w:t>
+      </w:r>
+      <w:r>
+        <w:t xml:space="preserve">references SRS §31 (global gates + feature ACs) rather than inventing new criteria.</w:t>
       </w:r>
     </w:p>
     <w:p>
@@ -16860,13 +17130,45 @@
           <w:b/>
           <w:bCs/>
         </w:rPr>
-        <w:t xml:space="preserve">Single phasing vocabulary:</w:t>
-      </w:r>
-      <w:r>
-        <w:t xml:space="preserve"> </w:t>
-      </w:r>
-      <w:r>
-        <w:t xml:space="preserve">eliminated any ambiguity between “Phase 2 (business logic)” and SRS “P2” by treating them as the same thing (P2 = the first application build phase after documentation).</w:t>
+        <w:t xml:space="preserve">Domains</w:t>
+      </w:r>
+      <w:r>
+        <w:t xml:space="preserve"> </w:t>
+      </w:r>
+      <w:r>
+        <w:t xml:space="preserve">in the WBS match SDD §14, including the two new P2 domains from</w:t>
+      </w:r>
+      <w:r>
+        <w:t xml:space="preserve"> </w:t>
+      </w:r>
+      <w:r>
+        <w:rPr>
+          <w:b/>
+          <w:bCs/>
+        </w:rPr>
+        <w:t xml:space="preserve">RES-01 (Locations)</w:t>
+      </w:r>
+      <w:r>
+        <w:t xml:space="preserve"> </w:t>
+      </w:r>
+      <w:r>
+        <w:t xml:space="preserve">and</w:t>
+      </w:r>
+      <w:r>
+        <w:t xml:space="preserve"> </w:t>
+      </w:r>
+      <w:r>
+        <w:rPr>
+          <w:b/>
+          <w:bCs/>
+        </w:rPr>
+        <w:t xml:space="preserve">RES-02 (Identity, Administration)</w:t>
+      </w:r>
+      <w:r>
+        <w:t xml:space="preserve"> </w:t>
+      </w:r>
+      <w:r>
+        <w:t xml:space="preserve">— the plan schedules exactly those.</w:t>
       </w:r>
     </w:p>
     <w:p>
@@ -16882,6 +17184,281 @@
           <w:b/>
           <w:bCs/>
         </w:rPr>
+        <w:t xml:space="preserve">Risks:</w:t>
+      </w:r>
+      <w:r>
+        <w:t xml:space="preserve"> </w:t>
+      </w:r>
+      <w:r>
+        <w:t xml:space="preserve">product/technical risks are inherited from SRS §32 (</w:t>
+      </w:r>
+      <w:r>
+        <w:rPr>
+          <w:rStyle w:val="VerbatimChar"/>
+        </w:rPr>
+        <w:t xml:space="preserve">RSK-*</w:t>
+      </w:r>
+      <w:r>
+        <w:t xml:space="preserve">) and</w:t>
+      </w:r>
+      <w:r>
+        <w:t xml:space="preserve"> </w:t>
+      </w:r>
+      <w:r>
+        <w:rPr>
+          <w:i/>
+          <w:iCs/>
+        </w:rPr>
+        <w:t xml:space="preserve">not duplicated</w:t>
+      </w:r>
+      <w:r>
+        <w:t xml:space="preserve">; only project/management risks (</w:t>
+      </w:r>
+      <w:r>
+        <w:rPr>
+          <w:rStyle w:val="VerbatimChar"/>
+        </w:rPr>
+        <w:t xml:space="preserve">PR-*</w:t>
+      </w:r>
+      <w:r>
+        <w:t xml:space="preserve">) are added here.</w:t>
+      </w:r>
+    </w:p>
+    <w:p>
+      <w:pPr>
+        <w:pStyle w:val="Compact"/>
+        <w:numPr>
+          <w:ilvl w:val="0"/>
+          <w:numId w:val="1020"/>
+        </w:numPr>
+      </w:pPr>
+      <w:r>
+        <w:rPr>
+          <w:b/>
+          <w:bCs/>
+        </w:rPr>
+        <w:t xml:space="preserve">Open decisions</w:t>
+      </w:r>
+      <w:r>
+        <w:t xml:space="preserve"> </w:t>
+      </w:r>
+      <w:r>
+        <w:t xml:space="preserve">(</w:t>
+      </w:r>
+      <w:r>
+        <w:rPr>
+          <w:rStyle w:val="VerbatimChar"/>
+        </w:rPr>
+        <w:t xml:space="preserve">OI-01..07</w:t>
+      </w:r>
+      <w:r>
+        <w:t xml:space="preserve">) are carried as change items in §25/§32, consistent with the SRS.</w:t>
+      </w:r>
+    </w:p>
+    <w:p>
+      <w:pPr>
+        <w:pStyle w:val="Compact"/>
+        <w:numPr>
+          <w:ilvl w:val="0"/>
+          <w:numId w:val="1020"/>
+        </w:numPr>
+      </w:pPr>
+      <w:r>
+        <w:rPr>
+          <w:b/>
+          <w:bCs/>
+        </w:rPr>
+        <w:t xml:space="preserve">Security/backup/deployment</w:t>
+      </w:r>
+      <w:r>
+        <w:t xml:space="preserve"> </w:t>
+      </w:r>
+      <w:r>
+        <w:t xml:space="preserve">reference SDD §29/§5/§37 and SRS NFR targets (RPO ≤ 24 h, RTO ≤ 4 h, uptime ≥ 99.5%) without restating them.</w:t>
+      </w:r>
+    </w:p>
+    <w:bookmarkEnd w:id="58"/>
+    <w:bookmarkStart w:id="59" w:name="c3-repository-consistency--confirmed"/>
+    <w:p>
+      <w:pPr>
+        <w:pStyle w:val="Heading3"/>
+      </w:pPr>
+      <w:r>
+        <w:t xml:space="preserve">C.3 Repository consistency — confirmed</w:t>
+      </w:r>
+    </w:p>
+    <w:p>
+      <w:pPr>
+        <w:pStyle w:val="FirstParagraph"/>
+      </w:pPr>
+      <w:r>
+        <w:t xml:space="preserve">CI gates,</w:t>
+      </w:r>
+      <w:r>
+        <w:t xml:space="preserve"> </w:t>
+      </w:r>
+      <w:r>
+        <w:rPr>
+          <w:rStyle w:val="VerbatimChar"/>
+        </w:rPr>
+        <w:t xml:space="preserve">make</w:t>
+      </w:r>
+      <w:r>
+        <w:t xml:space="preserve">/</w:t>
+      </w:r>
+      <w:r>
+        <w:rPr>
+          <w:rStyle w:val="VerbatimChar"/>
+        </w:rPr>
+        <w:t xml:space="preserve">scripts</w:t>
+      </w:r>
+      <w:r>
+        <w:t xml:space="preserve"> </w:t>
+      </w:r>
+      <w:r>
+        <w:t xml:space="preserve">commands, env-file strategy, Redis-for-everything scale-readiness, Sanctum stateful-domain config, and the</w:t>
+      </w:r>
+      <w:r>
+        <w:t xml:space="preserve"> </w:t>
+      </w:r>
+      <w:r>
+        <w:rPr>
+          <w:rStyle w:val="VerbatimChar"/>
+        </w:rPr>
+        <w:t xml:space="preserve">backup.sh</w:t>
+      </w:r>
+      <w:r>
+        <w:t xml:space="preserve">/</w:t>
+      </w:r>
+      <w:r>
+        <w:rPr>
+          <w:rStyle w:val="VerbatimChar"/>
+        </w:rPr>
+        <w:t xml:space="preserve">restore.sh</w:t>
+      </w:r>
+      <w:r>
+        <w:t xml:space="preserve"> </w:t>
+      </w:r>
+      <w:r>
+        <w:t xml:space="preserve">flow described here match the implemented files exactly (Appendix A). The “current state” table (§2.2) matches the git history (phases 0–7 + DB layer) and the SDD’s statement that the application layer is not yet built.</w:t>
+      </w:r>
+    </w:p>
+    <w:bookmarkEnd w:id="59"/>
+    <w:bookmarkStart w:id="60" w:name="c4-contradictions--duplication-removed"/>
+    <w:p>
+      <w:pPr>
+        <w:pStyle w:val="Heading3"/>
+      </w:pPr>
+      <w:r>
+        <w:t xml:space="preserve">C.4 Contradictions &amp; duplication removed</w:t>
+      </w:r>
+    </w:p>
+    <w:p>
+      <w:pPr>
+        <w:pStyle w:val="Compact"/>
+        <w:numPr>
+          <w:ilvl w:val="0"/>
+          <w:numId w:val="1021"/>
+        </w:numPr>
+      </w:pPr>
+      <w:r>
+        <w:rPr>
+          <w:b/>
+          <w:bCs/>
+        </w:rPr>
+        <w:t xml:space="preserve">No duplication of requirements/design/schema:</w:t>
+      </w:r>
+      <w:r>
+        <w:t xml:space="preserve"> </w:t>
+      </w:r>
+      <w:r>
+        <w:t xml:space="preserve">all referenced by ID; product scope defers to SRS §3; deployment/security defer to SDD.</w:t>
+      </w:r>
+    </w:p>
+    <w:p>
+      <w:pPr>
+        <w:pStyle w:val="Compact"/>
+        <w:numPr>
+          <w:ilvl w:val="0"/>
+          <w:numId w:val="1021"/>
+        </w:numPr>
+      </w:pPr>
+      <w:r>
+        <w:rPr>
+          <w:b/>
+          <w:bCs/>
+        </w:rPr>
+        <w:t xml:space="preserve">Risk duplication avoided:</w:t>
+      </w:r>
+      <w:r>
+        <w:t xml:space="preserve"> </w:t>
+      </w:r>
+      <w:r>
+        <w:t xml:space="preserve">SRS</w:t>
+      </w:r>
+      <w:r>
+        <w:t xml:space="preserve"> </w:t>
+      </w:r>
+      <w:r>
+        <w:rPr>
+          <w:rStyle w:val="VerbatimChar"/>
+        </w:rPr>
+        <w:t xml:space="preserve">RSK-*</w:t>
+      </w:r>
+      <w:r>
+        <w:t xml:space="preserve"> </w:t>
+      </w:r>
+      <w:r>
+        <w:t xml:space="preserve">referenced, not copied; management risks separated as</w:t>
+      </w:r>
+      <w:r>
+        <w:t xml:space="preserve"> </w:t>
+      </w:r>
+      <w:r>
+        <w:rPr>
+          <w:rStyle w:val="VerbatimChar"/>
+        </w:rPr>
+        <w:t xml:space="preserve">PR-*</w:t>
+      </w:r>
+      <w:r>
+        <w:t xml:space="preserve">.</w:t>
+      </w:r>
+    </w:p>
+    <w:p>
+      <w:pPr>
+        <w:pStyle w:val="Compact"/>
+        <w:numPr>
+          <w:ilvl w:val="0"/>
+          <w:numId w:val="1021"/>
+        </w:numPr>
+      </w:pPr>
+      <w:r>
+        <w:rPr>
+          <w:b/>
+          <w:bCs/>
+        </w:rPr>
+        <w:t xml:space="preserve">Single phasing vocabulary:</w:t>
+      </w:r>
+      <w:r>
+        <w:t xml:space="preserve"> </w:t>
+      </w:r>
+      <w:r>
+        <w:t xml:space="preserve">eliminated any ambiguity between “Phase 2 (business logic)” and SRS “P2” by treating them as the same thing (P2 = the first application build phase after documentation).</w:t>
+      </w:r>
+    </w:p>
+    <w:p>
+      <w:pPr>
+        <w:pStyle w:val="Compact"/>
+        <w:numPr>
+          <w:ilvl w:val="0"/>
+          <w:numId w:val="1021"/>
+        </w:numPr>
+      </w:pPr>
+      <w:r>
+        <w:rPr>
+          <w:b/>
+          <w:bCs/>
+        </w:rPr>
         <w:t xml:space="preserve">Assumptions consolidated</w:t>
       </w:r>
       <w:r>
@@ -16891,8 +17468,8 @@
         <w:t xml:space="preserve">in Appendix B and cross-referenced from the body, rather than scattered.</w:t>
       </w:r>
     </w:p>
-    <w:bookmarkEnd w:id="59"/>
-    <w:bookmarkStart w:id="60" w:name="c5-clarity--maintainability-improvements"/>
+    <w:bookmarkEnd w:id="60"/>
+    <w:bookmarkStart w:id="61" w:name="c5-clarity--maintainability-improvements"/>
     <w:p>
       <w:pPr>
         <w:pStyle w:val="Heading3"/>
@@ -16909,8 +17486,8 @@
         <w:t xml:space="preserve">Milestones are acceptance-defined (robust to schedule change); calendar figures are explicitly assumptions; the plan references living artifacts (CI, Makefile, docs) so it stays true as the repo evolves; every section ties to an owner and, where relevant, an SRS/SDD ID.</w:t>
       </w:r>
     </w:p>
-    <w:bookmarkEnd w:id="60"/>
-    <w:bookmarkStart w:id="61" w:name="c6-residual-items"/>
+    <w:bookmarkEnd w:id="61"/>
+    <w:bookmarkStart w:id="62" w:name="c6-residual-items"/>
     <w:p>
       <w:pPr>
         <w:pStyle w:val="Heading3"/>
@@ -16974,9 +17551,9 @@
         <w:t xml:space="preserve">End of Software Project Management Plan v1.0 — approved v1.0 project-specification baseline. Phase 2 development proceeds on separate go-ahead.</w:t>
       </w:r>
     </w:p>
-    <w:bookmarkEnd w:id="61"/>
     <w:bookmarkEnd w:id="62"/>
     <w:bookmarkEnd w:id="63"/>
+    <w:bookmarkEnd w:id="64"/>
     <w:sectPr>
       <w:headerReference w:type="default" r:id="rId9"/>
       <w:footerReference w:type="default" r:id="rId10"/>
@@ -17000,26 +17577,31 @@
       <w:pStyle w:val="Footer"/>
       <w:jc w:val="center"/>
     </w:pPr>
+    <w:r/>
     <w:r>
       <w:rPr>
-        <w:color w:val="777777"/>
         <w:sz w:val="16"/>
       </w:rPr>
-      <w:t xml:space="preserve">Internal — Confidential  ·  Page </w:t>
+      <w:t xml:space="preserve">Internal — Confidential  •  Page </w:t>
     </w:r>
     <w:r>
+      <w:rPr>
+        <w:sz w:val="16"/>
+      </w:rPr>
       <w:fldChar w:fldCharType="begin"/>
       <w:instrText xml:space="preserve">PAGE</w:instrText>
       <w:fldChar w:fldCharType="end"/>
     </w:r>
     <w:r>
       <w:rPr>
-        <w:color w:val="777777"/>
         <w:sz w:val="16"/>
       </w:rPr>
       <w:t xml:space="preserve"> of </w:t>
     </w:r>
     <w:r>
+      <w:rPr>
+        <w:sz w:val="16"/>
+      </w:rPr>
       <w:fldChar w:fldCharType="begin"/>
       <w:instrText xml:space="preserve">NUMPAGES</w:instrText>
       <w:fldChar w:fldCharType="end"/>
@@ -17054,12 +17636,12 @@
       <w:pStyle w:val="Header"/>
       <w:jc w:val="center"/>
     </w:pPr>
+    <w:r/>
     <w:r>
       <w:rPr>
-        <w:color w:val="777777"/>
         <w:sz w:val="16"/>
       </w:rPr>
-      <w:t>SCCIT-SPMP  ·  Software Project Management Plan (SPMP)  ·  v1.0</w:t>
+      <w:t>SCCIT-SPMP  •  Software Project Management Plan (SPMP)  •  v1.0</w:t>
     </w:r>
   </w:p>
 </w:hdr>
@@ -17338,12 +17920,6 @@
     <w:abstractNumId w:val="991"/>
   </w:num>
   <w:num w:numId="1002">
-    <w:abstractNumId w:val="991"/>
-  </w:num>
-  <w:num w:numId="1003">
-    <w:abstractNumId w:val="991"/>
-  </w:num>
-  <w:num w:numId="1004">
     <w:abstractNumId w:val="99411"/>
     <w:lvlOverride w:ilvl="0">
       <w:startOverride w:val="1"/>
@@ -17373,8 +17949,41 @@
       <w:startOverride w:val="1"/>
     </w:lvlOverride>
   </w:num>
+  <w:num w:numId="1003">
+    <w:abstractNumId w:val="991"/>
+  </w:num>
+  <w:num w:numId="1004">
+    <w:abstractNumId w:val="991"/>
+  </w:num>
   <w:num w:numId="1005">
-    <w:abstractNumId w:val="991"/>
+    <w:abstractNumId w:val="99411"/>
+    <w:lvlOverride w:ilvl="0">
+      <w:startOverride w:val="1"/>
+    </w:lvlOverride>
+    <w:lvlOverride w:ilvl="1">
+      <w:startOverride w:val="1"/>
+    </w:lvlOverride>
+    <w:lvlOverride w:ilvl="2">
+      <w:startOverride w:val="1"/>
+    </w:lvlOverride>
+    <w:lvlOverride w:ilvl="3">
+      <w:startOverride w:val="1"/>
+    </w:lvlOverride>
+    <w:lvlOverride w:ilvl="4">
+      <w:startOverride w:val="1"/>
+    </w:lvlOverride>
+    <w:lvlOverride w:ilvl="5">
+      <w:startOverride w:val="1"/>
+    </w:lvlOverride>
+    <w:lvlOverride w:ilvl="6">
+      <w:startOverride w:val="1"/>
+    </w:lvlOverride>
+    <w:lvlOverride w:ilvl="7">
+      <w:startOverride w:val="1"/>
+    </w:lvlOverride>
+    <w:lvlOverride w:ilvl="8">
+      <w:startOverride w:val="1"/>
+    </w:lvlOverride>
   </w:num>
   <w:num w:numId="1006">
     <w:abstractNumId w:val="991"/>
@@ -17419,6 +18028,9 @@
     <w:abstractNumId w:val="991"/>
   </w:num>
   <w:num w:numId="1020">
+    <w:abstractNumId w:val="991"/>
+  </w:num>
+  <w:num w:numId="1021">
     <w:abstractNumId w:val="991"/>
   </w:num>
 </w:numbering>

</xml_diff>